<commit_message>
Update: add new test reports (2026-10-08)
</commit_message>
<xml_diff>
--- a/Sprint20260907-20260918/HERO-68915_20261008_112534.docx
+++ b/Sprint20260907-20260918/HERO-68915_20261008_112534.docx
@@ -15,7 +15,7 @@
           <w:sz w:val="32"/>
           <w:u w:val="none"/>
         </w:rPr>
-        <w:t>HERO-68915 KDS2-DEV-08-6 : KDS Device Authentication Test Report</w:t>
+        <w:t>KDS Device Authentication Engineering Report</w:t>
       </w:r>
     </w:p>
     <w:p>
@@ -45,7 +45,7 @@
           <w:sz w:val="24"/>
           <w:u w:val="none"/>
         </w:rPr>
-        <w:t>1.Passcode Login</w:t>
+        <w:t>F1. Device Passcode Setup</w:t>
       </w:r>
     </w:p>
     <w:p>
@@ -60,7 +60,7 @@
           <w:sz w:val="22"/>
           <w:u w:val="none"/>
         </w:rPr>
-        <w:t>1.1.Login with correct passcode after device setup</w:t>
+        <w:t>F1.1. Set and Synchronize Device Passcode</w:t>
       </w:r>
     </w:p>
     <w:p>
@@ -81,7 +81,7 @@
     <w:p>
       <w:pPr>
         <w:spacing w:before="0" w:after="40"/>
-        <w:ind w:left="360" w:hanging="240"/>
+        <w:ind w:left="1080" w:hanging="240"/>
       </w:pPr>
       <w:r>
         <w:rPr>
@@ -91,13 +91,13 @@
           <w:sz w:val="20"/>
           <w:u w:val="none"/>
         </w:rPr>
-        <w:t>1. The KDS device build containing the HERO-68915 feature is deployed.</w:t>
+        <w:t>1. Administrator is logged in to Infrasys Cloud Admin page</w:t>
       </w:r>
     </w:p>
     <w:p>
       <w:pPr>
         <w:spacing w:before="0" w:after="40"/>
-        <w:ind w:left="360" w:hanging="240"/>
+        <w:ind w:left="1080" w:hanging="240"/>
       </w:pPr>
       <w:r>
         <w:rPr>
@@ -107,55 +107,7 @@
           <w:sz w:val="20"/>
           <w:u w:val="none"/>
         </w:rPr>
-        <w:t>2. The device passcode is set in Kitchen Display System &gt; Device Setup &gt; Devices &gt; Edit the device, and saved.</w:t>
-      </w:r>
-    </w:p>
-    <w:p>
-      <w:pPr>
-        <w:spacing w:before="0" w:after="40"/>
-        <w:ind w:left="360" w:hanging="240"/>
-      </w:pPr>
-      <w:r>
-        <w:rPr>
-          <w:rFonts w:ascii="Arial" w:hAnsi="Arial" w:eastAsia="Arial" w:cs="Arial"/>
-          <w:b w:val="0"/>
-          <w:color w:val="000000"/>
-          <w:sz w:val="20"/>
-          <w:u w:val="none"/>
-        </w:rPr>
-        <w:t>3. The updated device passcode is synchronized to the KDS device.</w:t>
-      </w:r>
-    </w:p>
-    <w:p>
-      <w:pPr>
-        <w:spacing w:before="0" w:after="40"/>
-        <w:ind w:left="360" w:hanging="240"/>
-      </w:pPr>
-      <w:r>
-        <w:rPr>
-          <w:rFonts w:ascii="Arial" w:hAnsi="Arial" w:eastAsia="Arial" w:cs="Arial"/>
-          <w:b w:val="0"/>
-          <w:color w:val="000000"/>
-          <w:sz w:val="20"/>
-          <w:u w:val="none"/>
-        </w:rPr>
-        <w:t>4. The Tenant ID and Device UID are set correctly in the KDS device settings.</w:t>
-      </w:r>
-    </w:p>
-    <w:p>
-      <w:pPr>
-        <w:spacing w:before="0" w:after="40"/>
-        <w:ind w:left="360" w:hanging="240"/>
-      </w:pPr>
-      <w:r>
-        <w:rPr>
-          <w:rFonts w:ascii="Arial" w:hAnsi="Arial" w:eastAsia="Arial" w:cs="Arial"/>
-          <w:b w:val="0"/>
-          <w:color w:val="000000"/>
-          <w:sz w:val="20"/>
-          <w:u w:val="none"/>
-        </w:rPr>
-        <w:t>5. The region is configured in the KDS device settings.</w:t>
+        <w:t>2. A KDS device record exists under Kitchen Display System &gt; Device Setup &gt; Devices</w:t>
       </w:r>
     </w:p>
     <w:p>
@@ -176,7 +128,7 @@
     <w:p>
       <w:pPr>
         <w:spacing w:before="0" w:after="40"/>
-        <w:ind w:left="360" w:hanging="240"/>
+        <w:ind w:left="1080" w:hanging="240"/>
       </w:pPr>
       <w:r>
         <w:rPr>
@@ -186,13 +138,13 @@
           <w:sz w:val="20"/>
           <w:u w:val="none"/>
         </w:rPr>
-        <w:t>1. Open the KDS web client.</w:t>
+        <w:t>1. Go to "Kitchen Display System &gt; Device Setup &gt; Devices" and edit the target device</w:t>
       </w:r>
     </w:p>
     <w:p>
       <w:pPr>
         <w:spacing w:before="0" w:after="40"/>
-        <w:ind w:left="360" w:hanging="240"/>
+        <w:ind w:left="1080" w:hanging="240"/>
       </w:pPr>
       <w:r>
         <w:rPr>
@@ -202,13 +154,13 @@
           <w:sz w:val="20"/>
           <w:u w:val="none"/>
         </w:rPr>
-        <w:t>2. On the login screen, verify only the passcode field is shown (Tenant ID, Device UID and region are already configured).</w:t>
+        <w:t>2. Enter and save the device passcode</w:t>
       </w:r>
     </w:p>
     <w:p>
       <w:pPr>
         <w:spacing w:before="0" w:after="40"/>
-        <w:ind w:left="360" w:hanging="240"/>
+        <w:ind w:left="1080" w:hanging="240"/>
       </w:pPr>
       <w:r>
         <w:rPr>
@@ -218,13 +170,13 @@
           <w:sz w:val="20"/>
           <w:u w:val="none"/>
         </w:rPr>
-        <w:t>3. Enter the correct passcode.</w:t>
+        <w:t>3. Confirm the updated passcode is synchronized to the KDS device</w:t>
       </w:r>
     </w:p>
     <w:p>
       <w:pPr>
         <w:spacing w:before="0" w:after="40"/>
-        <w:ind w:left="360" w:hanging="240"/>
+        <w:ind w:left="1080" w:hanging="240"/>
       </w:pPr>
       <w:r>
         <w:rPr>
@@ -234,7 +186,7 @@
           <w:sz w:val="20"/>
           <w:u w:val="none"/>
         </w:rPr>
-        <w:t>4. Submit the passcode.</w:t>
+        <w:t>4. Ensure the tenant ID and device UID are set correctly on the KDS device</w:t>
       </w:r>
     </w:p>
     <w:p>
@@ -255,7 +207,7 @@
     <w:p>
       <w:pPr>
         <w:spacing w:before="0" w:after="40"/>
-        <w:ind w:left="360" w:hanging="240"/>
+        <w:ind w:left="1080" w:hanging="240"/>
       </w:pPr>
       <w:r>
         <w:rPr>
@@ -265,13 +217,13 @@
           <w:sz w:val="20"/>
           <w:u w:val="none"/>
         </w:rPr>
-        <w:t>1. The login screen only requires the passcode to be entered.</w:t>
+        <w:t>1. The device passcode is saved successfully in the admin page</w:t>
       </w:r>
     </w:p>
     <w:p>
       <w:pPr>
         <w:spacing w:before="0" w:after="40"/>
-        <w:ind w:left="360" w:hanging="240"/>
+        <w:ind w:left="1080" w:hanging="240"/>
       </w:pPr>
       <w:r>
         <w:rPr>
@@ -281,13 +233,13 @@
           <w:sz w:val="20"/>
           <w:u w:val="none"/>
         </w:rPr>
-        <w:t>2. After submitting the correct passcode, the device starts loading the required data.</w:t>
+        <w:t>2. The updated passcode is synchronized to the KDS device</w:t>
       </w:r>
     </w:p>
     <w:p>
       <w:pPr>
         <w:spacing w:before="0" w:after="40"/>
-        <w:ind w:left="360" w:hanging="240"/>
+        <w:ind w:left="1080" w:hanging="240"/>
       </w:pPr>
       <w:r>
         <w:rPr>
@@ -297,23 +249,22 @@
           <w:sz w:val="20"/>
           <w:u w:val="none"/>
         </w:rPr>
-        <w:t>3. The app verifies the device session and finishes initial setup (handshake and device sync).</w:t>
+        <w:t>3. The KDS device accepts login with the updated passcode</w:t>
       </w:r>
     </w:p>
     <w:p>
       <w:pPr>
-        <w:spacing w:before="0" w:after="40"/>
-        <w:ind w:left="360" w:hanging="240"/>
+        <w:spacing w:before="160" w:after="80"/>
       </w:pPr>
       <w:r>
         <w:rPr>
           <w:rFonts w:ascii="Arial" w:hAnsi="Arial" w:eastAsia="Arial" w:cs="Arial"/>
-          <w:b w:val="0"/>
-          <w:color w:val="000000"/>
-          <w:sz w:val="20"/>
+          <w:b/>
+          <w:color w:val="001EFF"/>
+          <w:sz w:val="24"/>
           <w:u w:val="none"/>
         </w:rPr>
-        <w:t>4. After setup completes, the ticket page is shown.</w:t>
+        <w:t>F2. Passcode Login</w:t>
       </w:r>
     </w:p>
     <w:p>
@@ -328,7 +279,7 @@
           <w:sz w:val="22"/>
           <w:u w:val="none"/>
         </w:rPr>
-        <w:t>1.2.Login with incorrect passcode shows "Unauthorized client" error</w:t>
+        <w:t>F2.1. Login with Correct Passcode and Complete Initial Setup</w:t>
       </w:r>
     </w:p>
     <w:p>
@@ -349,7 +300,7 @@
     <w:p>
       <w:pPr>
         <w:spacing w:before="0" w:after="40"/>
-        <w:ind w:left="360" w:hanging="240"/>
+        <w:ind w:left="1080" w:hanging="240"/>
       </w:pPr>
       <w:r>
         <w:rPr>
@@ -359,13 +310,13 @@
           <w:sz w:val="20"/>
           <w:u w:val="none"/>
         </w:rPr>
-        <w:t>1. The KDS device build containing the HERO-68915 feature is deployed.</w:t>
+        <w:t>1. Tenant ID, Device UID and region are already configured in device settings</w:t>
       </w:r>
     </w:p>
     <w:p>
       <w:pPr>
         <w:spacing w:before="0" w:after="40"/>
-        <w:ind w:left="360" w:hanging="240"/>
+        <w:ind w:left="1080" w:hanging="240"/>
       </w:pPr>
       <w:r>
         <w:rPr>
@@ -375,23 +326,7 @@
           <w:sz w:val="20"/>
           <w:u w:val="none"/>
         </w:rPr>
-        <w:t>2. The device passcode is set and synchronized to the KDS device.</w:t>
-      </w:r>
-    </w:p>
-    <w:p>
-      <w:pPr>
-        <w:spacing w:before="0" w:after="40"/>
-        <w:ind w:left="360" w:hanging="240"/>
-      </w:pPr>
-      <w:r>
-        <w:rPr>
-          <w:rFonts w:ascii="Arial" w:hAnsi="Arial" w:eastAsia="Arial" w:cs="Arial"/>
-          <w:b w:val="0"/>
-          <w:color w:val="000000"/>
-          <w:sz w:val="20"/>
-          <w:u w:val="none"/>
-        </w:rPr>
-        <w:t>3. The Tenant ID and Device UID are set correctly.</w:t>
+        <w:t>2. The device passcode has been set and synchronized</w:t>
       </w:r>
     </w:p>
     <w:p>
@@ -412,7 +347,7 @@
     <w:p>
       <w:pPr>
         <w:spacing w:before="0" w:after="40"/>
-        <w:ind w:left="360" w:hanging="240"/>
+        <w:ind w:left="1080" w:hanging="240"/>
       </w:pPr>
       <w:r>
         <w:rPr>
@@ -422,13 +357,13 @@
           <w:sz w:val="20"/>
           <w:u w:val="none"/>
         </w:rPr>
-        <w:t>1. Open the KDS web client.</w:t>
+        <w:t>1. Open the KDS web client</w:t>
       </w:r>
     </w:p>
     <w:p>
       <w:pPr>
         <w:spacing w:before="0" w:after="40"/>
-        <w:ind w:left="360" w:hanging="240"/>
+        <w:ind w:left="1080" w:hanging="240"/>
       </w:pPr>
       <w:r>
         <w:rPr>
@@ -438,13 +373,13 @@
           <w:sz w:val="20"/>
           <w:u w:val="none"/>
         </w:rPr>
-        <w:t>2. On the login screen, enter an incorrect passcode.</w:t>
+        <w:t>2. Enter only the passcode on the login screen and submit</w:t>
       </w:r>
     </w:p>
     <w:p>
       <w:pPr>
         <w:spacing w:before="0" w:after="40"/>
-        <w:ind w:left="360" w:hanging="240"/>
+        <w:ind w:left="1080" w:hanging="240"/>
       </w:pPr>
       <w:r>
         <w:rPr>
@@ -454,7 +389,7 @@
           <w:sz w:val="20"/>
           <w:u w:val="none"/>
         </w:rPr>
-        <w:t>3. Submit the passcode.</w:t>
+        <w:t>3. Wait for the device session verification, handshake and device sync to finish</w:t>
       </w:r>
     </w:p>
     <w:p>
@@ -475,7 +410,7 @@
     <w:p>
       <w:pPr>
         <w:spacing w:before="0" w:after="40"/>
-        <w:ind w:left="360" w:hanging="240"/>
+        <w:ind w:left="1080" w:hanging="240"/>
       </w:pPr>
       <w:r>
         <w:rPr>
@@ -485,13 +420,13 @@
           <w:sz w:val="20"/>
           <w:u w:val="none"/>
         </w:rPr>
-        <w:t>1. The login fails and an error message "Unauthorized client" is shown on the login screen.</w:t>
+        <w:t>1. Only the passcode is requested; Tenant ID, Device UID and region do not need to be entered</w:t>
       </w:r>
     </w:p>
     <w:p>
       <w:pPr>
         <w:spacing w:before="0" w:after="40"/>
-        <w:ind w:left="360" w:hanging="240"/>
+        <w:ind w:left="1080" w:hanging="240"/>
       </w:pPr>
       <w:r>
         <w:rPr>
@@ -501,13 +436,13 @@
           <w:sz w:val="20"/>
           <w:u w:val="none"/>
         </w:rPr>
-        <w:t>2. The device does not proceed to the ticket page.</w:t>
+        <w:t>2. Login succeeds and a secure web session is established</w:t>
       </w:r>
     </w:p>
     <w:p>
       <w:pPr>
         <w:spacing w:before="0" w:after="40"/>
-        <w:ind w:left="360" w:hanging="240"/>
+        <w:ind w:left="1080" w:hanging="240"/>
       </w:pPr>
       <w:r>
         <w:rPr>
@@ -517,7 +452,23 @@
           <w:sz w:val="20"/>
           <w:u w:val="none"/>
         </w:rPr>
-        <w:t>3. The user can re-enter the passcode and try again.</w:t>
+        <w:t>3. The app verifies the device session and completes handshake and device sync before showing tickets</w:t>
+      </w:r>
+    </w:p>
+    <w:p>
+      <w:pPr>
+        <w:spacing w:before="0" w:after="40"/>
+        <w:ind w:left="1080" w:hanging="240"/>
+      </w:pPr>
+      <w:r>
+        <w:rPr>
+          <w:rFonts w:ascii="Arial" w:hAnsi="Arial" w:eastAsia="Arial" w:cs="Arial"/>
+          <w:b w:val="0"/>
+          <w:color w:val="000000"/>
+          <w:sz w:val="20"/>
+          <w:u w:val="none"/>
+        </w:rPr>
+        <w:t>4. The tickets page is displayed after initial setup finishes</w:t>
       </w:r>
     </w:p>
     <w:p>
@@ -532,7 +483,7 @@
           <w:sz w:val="22"/>
           <w:u w:val="none"/>
         </w:rPr>
-        <w:t>1.3.Login with network error shows a clear message on the login screen</w:t>
+        <w:t>F2.2. Login with Incorrect Passcode</w:t>
       </w:r>
     </w:p>
     <w:p>
@@ -553,7 +504,7 @@
     <w:p>
       <w:pPr>
         <w:spacing w:before="0" w:after="40"/>
-        <w:ind w:left="360" w:hanging="240"/>
+        <w:ind w:left="1080" w:hanging="240"/>
       </w:pPr>
       <w:r>
         <w:rPr>
@@ -563,39 +514,7 @@
           <w:sz w:val="20"/>
           <w:u w:val="none"/>
         </w:rPr>
-        <w:t>1. The KDS device build containing the HERO-68915 feature is deployed.</w:t>
-      </w:r>
-    </w:p>
-    <w:p>
-      <w:pPr>
-        <w:spacing w:before="0" w:after="40"/>
-        <w:ind w:left="360" w:hanging="240"/>
-      </w:pPr>
-      <w:r>
-        <w:rPr>
-          <w:rFonts w:ascii="Arial" w:hAnsi="Arial" w:eastAsia="Arial" w:cs="Arial"/>
-          <w:b w:val="0"/>
-          <w:color w:val="000000"/>
-          <w:sz w:val="20"/>
-          <w:u w:val="none"/>
-        </w:rPr>
-        <w:t>2. The device passcode is set and synchronized.</w:t>
-      </w:r>
-    </w:p>
-    <w:p>
-      <w:pPr>
-        <w:spacing w:before="0" w:after="40"/>
-        <w:ind w:left="360" w:hanging="240"/>
-      </w:pPr>
-      <w:r>
-        <w:rPr>
-          <w:rFonts w:ascii="Arial" w:hAnsi="Arial" w:eastAsia="Arial" w:cs="Arial"/>
-          <w:b w:val="0"/>
-          <w:color w:val="000000"/>
-          <w:sz w:val="20"/>
-          <w:u w:val="none"/>
-        </w:rPr>
-        <w:t>3. The network can be disconnected or the OAuth service can be made unreachable.</w:t>
+        <w:t>1. The KDS device is signed out and the login screen is displayed</w:t>
       </w:r>
     </w:p>
     <w:p>
@@ -616,7 +535,7 @@
     <w:p>
       <w:pPr>
         <w:spacing w:before="0" w:after="40"/>
-        <w:ind w:left="360" w:hanging="240"/>
+        <w:ind w:left="1080" w:hanging="240"/>
       </w:pPr>
       <w:r>
         <w:rPr>
@@ -626,55 +545,7 @@
           <w:sz w:val="20"/>
           <w:u w:val="none"/>
         </w:rPr>
-        <w:t>1. Open the KDS web client.</w:t>
-      </w:r>
-    </w:p>
-    <w:p>
-      <w:pPr>
-        <w:spacing w:before="0" w:after="40"/>
-        <w:ind w:left="360" w:hanging="240"/>
-      </w:pPr>
-      <w:r>
-        <w:rPr>
-          <w:rFonts w:ascii="Arial" w:hAnsi="Arial" w:eastAsia="Arial" w:cs="Arial"/>
-          <w:b w:val="0"/>
-          <w:color w:val="000000"/>
-          <w:sz w:val="20"/>
-          <w:u w:val="none"/>
-        </w:rPr>
-        <w:t>2. Disconnect the network or make the regional OAuth service unreachable.</w:t>
-      </w:r>
-    </w:p>
-    <w:p>
-      <w:pPr>
-        <w:spacing w:before="0" w:after="40"/>
-        <w:ind w:left="360" w:hanging="240"/>
-      </w:pPr>
-      <w:r>
-        <w:rPr>
-          <w:rFonts w:ascii="Arial" w:hAnsi="Arial" w:eastAsia="Arial" w:cs="Arial"/>
-          <w:b w:val="0"/>
-          <w:color w:val="000000"/>
-          <w:sz w:val="20"/>
-          <w:u w:val="none"/>
-        </w:rPr>
-        <w:t>3. On the login screen, enter the correct passcode.</w:t>
-      </w:r>
-    </w:p>
-    <w:p>
-      <w:pPr>
-        <w:spacing w:before="0" w:after="40"/>
-        <w:ind w:left="360" w:hanging="240"/>
-      </w:pPr>
-      <w:r>
-        <w:rPr>
-          <w:rFonts w:ascii="Arial" w:hAnsi="Arial" w:eastAsia="Arial" w:cs="Arial"/>
-          <w:b w:val="0"/>
-          <w:color w:val="000000"/>
-          <w:sz w:val="20"/>
-          <w:u w:val="none"/>
-        </w:rPr>
-        <w:t>4. Submit the passcode.</w:t>
+        <w:t>1. Enter an incorrect passcode and submit</w:t>
       </w:r>
     </w:p>
     <w:p>
@@ -695,7 +566,7 @@
     <w:p>
       <w:pPr>
         <w:spacing w:before="0" w:after="40"/>
-        <w:ind w:left="360" w:hanging="240"/>
+        <w:ind w:left="1080" w:hanging="240"/>
       </w:pPr>
       <w:r>
         <w:rPr>
@@ -705,13 +576,13 @@
           <w:sz w:val="20"/>
           <w:u w:val="none"/>
         </w:rPr>
-        <w:t>1. The login fails due to the network error.</w:t>
+        <w:t>1. Login is rejected</w:t>
       </w:r>
     </w:p>
     <w:p>
       <w:pPr>
         <w:spacing w:before="0" w:after="40"/>
-        <w:ind w:left="360" w:hanging="240"/>
+        <w:ind w:left="1080" w:hanging="240"/>
       </w:pPr>
       <w:r>
         <w:rPr>
@@ -721,13 +592,13 @@
           <w:sz w:val="20"/>
           <w:u w:val="none"/>
         </w:rPr>
-        <w:t>2. A clear error message is shown on the login screen indicating a network or connection issue.</w:t>
+        <w:t>2. The error message "Unauthorized client" is shown on the login screen</w:t>
       </w:r>
     </w:p>
     <w:p>
       <w:pPr>
         <w:spacing w:before="0" w:after="40"/>
-        <w:ind w:left="360" w:hanging="240"/>
+        <w:ind w:left="1080" w:hanging="240"/>
       </w:pPr>
       <w:r>
         <w:rPr>
@@ -737,38 +608,7 @@
           <w:sz w:val="20"/>
           <w:u w:val="none"/>
         </w:rPr>
-        <w:t>3. The device does not proceed to the ticket page.</w:t>
-      </w:r>
-    </w:p>
-    <w:p>
-      <w:pPr>
-        <w:spacing w:before="0" w:after="40"/>
-        <w:ind w:left="360" w:hanging="240"/>
-      </w:pPr>
-      <w:r>
-        <w:rPr>
-          <w:rFonts w:ascii="Arial" w:hAnsi="Arial" w:eastAsia="Arial" w:cs="Arial"/>
-          <w:b w:val="0"/>
-          <w:color w:val="000000"/>
-          <w:sz w:val="20"/>
-          <w:u w:val="none"/>
-        </w:rPr>
-        <w:t>4. The user can retry the login after the network is restored.</w:t>
-      </w:r>
-    </w:p>
-    <w:p>
-      <w:pPr>
-        <w:spacing w:before="160" w:after="80"/>
-      </w:pPr>
-      <w:r>
-        <w:rPr>
-          <w:rFonts w:ascii="Arial" w:hAnsi="Arial" w:eastAsia="Arial" w:cs="Arial"/>
-          <w:b/>
-          <w:color w:val="001EFF"/>
-          <w:sz w:val="24"/>
-          <w:u w:val="none"/>
-        </w:rPr>
-        <w:t>2.Session Management - Validity and Refresh</w:t>
+        <w:t>3. The device remains on the login screen and no ticket data is loaded</w:t>
       </w:r>
     </w:p>
     <w:p>
@@ -783,7 +623,7 @@
           <w:sz w:val="22"/>
           <w:u w:val="none"/>
         </w:rPr>
-        <w:t>2.1.Session stays valid for 1 day and then the user is logged out</w:t>
+        <w:t>F2.3. Login with Network Error</w:t>
       </w:r>
     </w:p>
     <w:p>
@@ -804,7 +644,7 @@
     <w:p>
       <w:pPr>
         <w:spacing w:before="0" w:after="40"/>
-        <w:ind w:left="360" w:hanging="240"/>
+        <w:ind w:left="1080" w:hanging="240"/>
       </w:pPr>
       <w:r>
         <w:rPr>
@@ -814,23 +654,7 @@
           <w:sz w:val="20"/>
           <w:u w:val="none"/>
         </w:rPr>
-        <w:t>1. The KDS device is successfully logged in with the correct passcode.</w:t>
-      </w:r>
-    </w:p>
-    <w:p>
-      <w:pPr>
-        <w:spacing w:before="0" w:after="40"/>
-        <w:ind w:left="360" w:hanging="240"/>
-      </w:pPr>
-      <w:r>
-        <w:rPr>
-          <w:rFonts w:ascii="Arial" w:hAnsi="Arial" w:eastAsia="Arial" w:cs="Arial"/>
-          <w:b w:val="0"/>
-          <w:color w:val="000000"/>
-          <w:sz w:val="20"/>
-          <w:u w:val="none"/>
-        </w:rPr>
-        <w:t>2. The session validity period is set to 1 day.</w:t>
+        <w:t>1. The KDS device cannot reach the regional OAuth service</w:t>
       </w:r>
     </w:p>
     <w:p>
@@ -851,7 +675,7 @@
     <w:p>
       <w:pPr>
         <w:spacing w:before="0" w:after="40"/>
-        <w:ind w:left="360" w:hanging="240"/>
+        <w:ind w:left="1080" w:hanging="240"/>
       </w:pPr>
       <w:r>
         <w:rPr>
@@ -861,39 +685,7 @@
           <w:sz w:val="20"/>
           <w:u w:val="none"/>
         </w:rPr>
-        <w:t>1. After a successful login, verify the device is on the ticket page and the session is active.</w:t>
-      </w:r>
-    </w:p>
-    <w:p>
-      <w:pPr>
-        <w:spacing w:before="0" w:after="40"/>
-        <w:ind w:left="360" w:hanging="240"/>
-      </w:pPr>
-      <w:r>
-        <w:rPr>
-          <w:rFonts w:ascii="Arial" w:hAnsi="Arial" w:eastAsia="Arial" w:cs="Arial"/>
-          <w:b w:val="0"/>
-          <w:color w:val="000000"/>
-          <w:sz w:val="20"/>
-          <w:u w:val="none"/>
-        </w:rPr>
-        <w:t>2. Wait for the session to approach expiry (or simulate the session expiry by advancing the session timestamp).</w:t>
-      </w:r>
-    </w:p>
-    <w:p>
-      <w:pPr>
-        <w:spacing w:before="0" w:after="40"/>
-        <w:ind w:left="360" w:hanging="240"/>
-      </w:pPr>
-      <w:r>
-        <w:rPr>
-          <w:rFonts w:ascii="Arial" w:hAnsi="Arial" w:eastAsia="Arial" w:cs="Arial"/>
-          <w:b w:val="0"/>
-          <w:color w:val="000000"/>
-          <w:sz w:val="20"/>
-          <w:u w:val="none"/>
-        </w:rPr>
-        <w:t>3. Verify the device behavior when the session expires.</w:t>
+        <w:t>1. Enter the passcode and submit on the login screen</w:t>
       </w:r>
     </w:p>
     <w:p>
@@ -914,7 +706,7 @@
     <w:p>
       <w:pPr>
         <w:spacing w:before="0" w:after="40"/>
-        <w:ind w:left="360" w:hanging="240"/>
+        <w:ind w:left="1080" w:hanging="240"/>
       </w:pPr>
       <w:r>
         <w:rPr>
@@ -924,13 +716,13 @@
           <w:sz w:val="20"/>
           <w:u w:val="none"/>
         </w:rPr>
-        <w:t>1. The session remains valid for 1 day after login.</w:t>
+        <w:t>1. A clear network error message is displayed on the login screen</w:t>
       </w:r>
     </w:p>
     <w:p>
       <w:pPr>
         <w:spacing w:before="0" w:after="40"/>
-        <w:ind w:left="360" w:hanging="240"/>
+        <w:ind w:left="1080" w:hanging="240"/>
       </w:pPr>
       <w:r>
         <w:rPr>
@@ -940,23 +732,22 @@
           <w:sz w:val="20"/>
           <w:u w:val="none"/>
         </w:rPr>
-        <w:t>2. When the session expires (after approximately 1 day), the device is automatically logged out.</w:t>
+        <w:t>2. The user remains on the login screen and can retry after the network is restored</w:t>
       </w:r>
     </w:p>
     <w:p>
       <w:pPr>
-        <w:spacing w:before="0" w:after="40"/>
-        <w:ind w:left="360" w:hanging="240"/>
+        <w:spacing w:before="160" w:after="80"/>
       </w:pPr>
       <w:r>
         <w:rPr>
           <w:rFonts w:ascii="Arial" w:hAnsi="Arial" w:eastAsia="Arial" w:cs="Arial"/>
-          <w:b w:val="0"/>
-          <w:color w:val="000000"/>
-          <w:sz w:val="20"/>
+          <w:b/>
+          <w:color w:val="001EFF"/>
+          <w:sz w:val="24"/>
           <w:u w:val="none"/>
         </w:rPr>
-        <w:t>3. The user is returned to the login screen and must sign in again with the passcode.</w:t>
+        <w:t>F3. Session Management</w:t>
       </w:r>
     </w:p>
     <w:p>
@@ -971,7 +762,7 @@
           <w:sz w:val="22"/>
           <w:u w:val="none"/>
         </w:rPr>
-        <w:t>2.2.Browser refresh keeps the user signed in if the session is still valid</w:t>
+        <w:t>F3.1. Session Expires After One Day</w:t>
       </w:r>
     </w:p>
     <w:p>
@@ -992,7 +783,7 @@
     <w:p>
       <w:pPr>
         <w:spacing w:before="0" w:after="40"/>
-        <w:ind w:left="360" w:hanging="240"/>
+        <w:ind w:left="1080" w:hanging="240"/>
       </w:pPr>
       <w:r>
         <w:rPr>
@@ -1002,7 +793,7 @@
           <w:sz w:val="20"/>
           <w:u w:val="none"/>
         </w:rPr>
-        <w:t>1. The KDS device is successfully logged in and the session is still valid (within the 1-day period).</w:t>
+        <w:t>1. The KDS device is successfully logged in</w:t>
       </w:r>
     </w:p>
     <w:p>
@@ -1023,7 +814,7 @@
     <w:p>
       <w:pPr>
         <w:spacing w:before="0" w:after="40"/>
-        <w:ind w:left="360" w:hanging="240"/>
+        <w:ind w:left="1080" w:hanging="240"/>
       </w:pPr>
       <w:r>
         <w:rPr>
@@ -1033,13 +824,13 @@
           <w:sz w:val="20"/>
           <w:u w:val="none"/>
         </w:rPr>
-        <w:t>1. After a successful login, verify the device is on the ticket page.</w:t>
+        <w:t>1. Keep the session until the one-day validity period is reached</w:t>
       </w:r>
     </w:p>
     <w:p>
       <w:pPr>
         <w:spacing w:before="0" w:after="40"/>
-        <w:ind w:left="360" w:hanging="240"/>
+        <w:ind w:left="1080" w:hanging="240"/>
       </w:pPr>
       <w:r>
         <w:rPr>
@@ -1049,23 +840,7 @@
           <w:sz w:val="20"/>
           <w:u w:val="none"/>
         </w:rPr>
-        <w:t>2. Refresh the browser (F5 or browser refresh button).</w:t>
-      </w:r>
-    </w:p>
-    <w:p>
-      <w:pPr>
-        <w:spacing w:before="0" w:after="40"/>
-        <w:ind w:left="360" w:hanging="240"/>
-      </w:pPr>
-      <w:r>
-        <w:rPr>
-          <w:rFonts w:ascii="Arial" w:hAnsi="Arial" w:eastAsia="Arial" w:cs="Arial"/>
-          <w:b w:val="0"/>
-          <w:color w:val="000000"/>
-          <w:sz w:val="20"/>
-          <w:u w:val="none"/>
-        </w:rPr>
-        <w:t>3. Verify the device behavior after the refresh.</w:t>
+        <w:t>2. Observe the client behavior around expiry</w:t>
       </w:r>
     </w:p>
     <w:p>
@@ -1086,7 +861,7 @@
     <w:p>
       <w:pPr>
         <w:spacing w:before="0" w:after="40"/>
-        <w:ind w:left="360" w:hanging="240"/>
+        <w:ind w:left="1080" w:hanging="240"/>
       </w:pPr>
       <w:r>
         <w:rPr>
@@ -1096,13 +871,13 @@
           <w:sz w:val="20"/>
           <w:u w:val="none"/>
         </w:rPr>
-        <w:t>1. After refreshing the browser, the user remains signed in because the session is still valid.</w:t>
+        <w:t>1. The login session stays valid for 1 day</w:t>
       </w:r>
     </w:p>
     <w:p>
       <w:pPr>
         <w:spacing w:before="0" w:after="40"/>
-        <w:ind w:left="360" w:hanging="240"/>
+        <w:ind w:left="1080" w:hanging="240"/>
       </w:pPr>
       <w:r>
         <w:rPr>
@@ -1112,13 +887,13 @@
           <w:sz w:val="20"/>
           <w:u w:val="none"/>
         </w:rPr>
-        <w:t>2. The app verifies the device session from the secure cookie and restores the signed-in state.</w:t>
+        <w:t>2. The device is automatically logged out when the session expires</w:t>
       </w:r>
     </w:p>
     <w:p>
       <w:pPr>
         <w:spacing w:before="0" w:after="40"/>
-        <w:ind w:left="360" w:hanging="240"/>
+        <w:ind w:left="1080" w:hanging="240"/>
       </w:pPr>
       <w:r>
         <w:rPr>
@@ -1128,7 +903,7 @@
           <w:sz w:val="20"/>
           <w:u w:val="none"/>
         </w:rPr>
-        <w:t>3. The ticket page is shown again without requiring a new login.</w:t>
+        <w:t>3. The user must sign in again with the passcode to access tickets</w:t>
       </w:r>
     </w:p>
     <w:p>
@@ -1143,7 +918,7 @@
           <w:sz w:val="22"/>
           <w:u w:val="none"/>
         </w:rPr>
-        <w:t>2.3.Browser refresh logs the user out if the session has expired</w:t>
+        <w:t>F3.2. Remain Signed In After Browser Refresh</w:t>
       </w:r>
     </w:p>
     <w:p>
@@ -1164,7 +939,7 @@
     <w:p>
       <w:pPr>
         <w:spacing w:before="0" w:after="40"/>
-        <w:ind w:left="360" w:hanging="240"/>
+        <w:ind w:left="1080" w:hanging="240"/>
       </w:pPr>
       <w:r>
         <w:rPr>
@@ -1174,7 +949,7 @@
           <w:sz w:val="20"/>
           <w:u w:val="none"/>
         </w:rPr>
-        <w:t>1. The KDS device was logged in but the session has expired (more than 1 day has passed).</w:t>
+        <w:t>1. The KDS device is logged in and the session is still valid</w:t>
       </w:r>
     </w:p>
     <w:p>
@@ -1195,7 +970,7 @@
     <w:p>
       <w:pPr>
         <w:spacing w:before="0" w:after="40"/>
-        <w:ind w:left="360" w:hanging="240"/>
+        <w:ind w:left="1080" w:hanging="240"/>
       </w:pPr>
       <w:r>
         <w:rPr>
@@ -1205,23 +980,7 @@
           <w:sz w:val="20"/>
           <w:u w:val="none"/>
         </w:rPr>
-        <w:t>1. After the session has expired, refresh the browser.</w:t>
-      </w:r>
-    </w:p>
-    <w:p>
-      <w:pPr>
-        <w:spacing w:before="0" w:after="40"/>
-        <w:ind w:left="360" w:hanging="240"/>
-      </w:pPr>
-      <w:r>
-        <w:rPr>
-          <w:rFonts w:ascii="Arial" w:hAnsi="Arial" w:eastAsia="Arial" w:cs="Arial"/>
-          <w:b w:val="0"/>
-          <w:color w:val="000000"/>
-          <w:sz w:val="20"/>
-          <w:u w:val="none"/>
-        </w:rPr>
-        <w:t>2. Verify the device behavior after the refresh.</w:t>
+        <w:t>1. Refresh the browser while viewing the tickets screen</w:t>
       </w:r>
     </w:p>
     <w:p>
@@ -1242,7 +1001,7 @@
     <w:p>
       <w:pPr>
         <w:spacing w:before="0" w:after="40"/>
-        <w:ind w:left="360" w:hanging="240"/>
+        <w:ind w:left="1080" w:hanging="240"/>
       </w:pPr>
       <w:r>
         <w:rPr>
@@ -1252,13 +1011,13 @@
           <w:sz w:val="20"/>
           <w:u w:val="none"/>
         </w:rPr>
-        <w:t>1. After refreshing the browser with an expired session, the user is logged out.</w:t>
+        <w:t>1. The session check recognizes the valid secure cookie</w:t>
       </w:r>
     </w:p>
     <w:p>
       <w:pPr>
         <w:spacing w:before="0" w:after="40"/>
-        <w:ind w:left="360" w:hanging="240"/>
+        <w:ind w:left="1080" w:hanging="240"/>
       </w:pPr>
       <w:r>
         <w:rPr>
@@ -1268,13 +1027,13 @@
           <w:sz w:val="20"/>
           <w:u w:val="none"/>
         </w:rPr>
-        <w:t>2. The login screen is shown, requiring the user to sign in again with the passcode.</w:t>
+        <w:t>2. The user remains signed in after the refresh</w:t>
       </w:r>
     </w:p>
     <w:p>
       <w:pPr>
         <w:spacing w:before="0" w:after="40"/>
-        <w:ind w:left="360" w:hanging="240"/>
+        <w:ind w:left="1080" w:hanging="240"/>
       </w:pPr>
       <w:r>
         <w:rPr>
@@ -1284,22 +1043,7 @@
           <w:sz w:val="20"/>
           <w:u w:val="none"/>
         </w:rPr>
-        <w:t>3. The expired session is not restored.</w:t>
-      </w:r>
-    </w:p>
-    <w:p>
-      <w:pPr>
-        <w:spacing w:before="160" w:after="80"/>
-      </w:pPr>
-      <w:r>
-        <w:rPr>
-          <w:rFonts w:ascii="Arial" w:hAnsi="Arial" w:eastAsia="Arial" w:cs="Arial"/>
-          <w:b/>
-          <w:color w:val="001EFF"/>
-          <w:sz w:val="24"/>
-          <w:u w:val="none"/>
-        </w:rPr>
-        <w:t>3.Session Revocation and Unauthorized Access</w:t>
+        <w:t>3. The tickets screen is shown without requiring the passcode again</w:t>
       </w:r>
     </w:p>
     <w:p>
@@ -1314,7 +1058,7 @@
           <w:sz w:val="22"/>
           <w:u w:val="none"/>
         </w:rPr>
-        <w:t>3.1.Server returns unauthorized and the user is sent back to the login screen</w:t>
+        <w:t>F3.3. Manual Logout</w:t>
       </w:r>
     </w:p>
     <w:p>
@@ -1335,7 +1079,7 @@
     <w:p>
       <w:pPr>
         <w:spacing w:before="0" w:after="40"/>
-        <w:ind w:left="360" w:hanging="240"/>
+        <w:ind w:left="1080" w:hanging="240"/>
       </w:pPr>
       <w:r>
         <w:rPr>
@@ -1345,23 +1089,7 @@
           <w:sz w:val="20"/>
           <w:u w:val="none"/>
         </w:rPr>
-        <w:t>1. The KDS device is successfully logged in and the session is active.</w:t>
-      </w:r>
-    </w:p>
-    <w:p>
-      <w:pPr>
-        <w:spacing w:before="0" w:after="40"/>
-        <w:ind w:left="360" w:hanging="240"/>
-      </w:pPr>
-      <w:r>
-        <w:rPr>
-          <w:rFonts w:ascii="Arial" w:hAnsi="Arial" w:eastAsia="Arial" w:cs="Arial"/>
-          <w:b w:val="0"/>
-          <w:color w:val="000000"/>
-          <w:sz w:val="20"/>
-          <w:u w:val="none"/>
-        </w:rPr>
-        <w:t>2. The server can be configured to return an unauthorized response for the device session.</w:t>
+        <w:t>1. The KDS device is logged in</w:t>
       </w:r>
     </w:p>
     <w:p>
@@ -1382,7 +1110,7 @@
     <w:p>
       <w:pPr>
         <w:spacing w:before="0" w:after="40"/>
-        <w:ind w:left="360" w:hanging="240"/>
+        <w:ind w:left="1080" w:hanging="240"/>
       </w:pPr>
       <w:r>
         <w:rPr>
@@ -1392,39 +1120,7 @@
           <w:sz w:val="20"/>
           <w:u w:val="none"/>
         </w:rPr>
-        <w:t>1. After a successful login, configure the server to return an unauthorized response for the device session.</w:t>
-      </w:r>
-    </w:p>
-    <w:p>
-      <w:pPr>
-        <w:spacing w:before="0" w:after="40"/>
-        <w:ind w:left="360" w:hanging="240"/>
-      </w:pPr>
-      <w:r>
-        <w:rPr>
-          <w:rFonts w:ascii="Arial" w:hAnsi="Arial" w:eastAsia="Arial" w:cs="Arial"/>
-          <w:b w:val="0"/>
-          <w:color w:val="000000"/>
-          <w:sz w:val="20"/>
-          <w:u w:val="none"/>
-        </w:rPr>
-        <w:t>2. Perform an action that triggers a server request (e.g., navigate or refresh).</w:t>
-      </w:r>
-    </w:p>
-    <w:p>
-      <w:pPr>
-        <w:spacing w:before="0" w:after="40"/>
-        <w:ind w:left="360" w:hanging="240"/>
-      </w:pPr>
-      <w:r>
-        <w:rPr>
-          <w:rFonts w:ascii="Arial" w:hAnsi="Arial" w:eastAsia="Arial" w:cs="Arial"/>
-          <w:b w:val="0"/>
-          <w:color w:val="000000"/>
-          <w:sz w:val="20"/>
-          <w:u w:val="none"/>
-        </w:rPr>
-        <w:t>3. Verify the device behavior when the server returns unauthorized.</w:t>
+        <w:t>1. Trigger logout from the header</w:t>
       </w:r>
     </w:p>
     <w:p>
@@ -1445,7 +1141,7 @@
     <w:p>
       <w:pPr>
         <w:spacing w:before="0" w:after="40"/>
-        <w:ind w:left="360" w:hanging="240"/>
+        <w:ind w:left="1080" w:hanging="240"/>
       </w:pPr>
       <w:r>
         <w:rPr>
@@ -1455,13 +1151,13 @@
           <w:sz w:val="20"/>
           <w:u w:val="none"/>
         </w:rPr>
-        <w:t>1. When the server returns unauthorized, the user is sent back to the login screen.</w:t>
+        <w:t>1. The server session is revoked when possible and local login state is cleared</w:t>
       </w:r>
     </w:p>
     <w:p>
       <w:pPr>
         <w:spacing w:before="0" w:after="40"/>
-        <w:ind w:left="360" w:hanging="240"/>
+        <w:ind w:left="1080" w:hanging="240"/>
       </w:pPr>
       <w:r>
         <w:rPr>
@@ -1471,13 +1167,13 @@
           <w:sz w:val="20"/>
           <w:u w:val="none"/>
         </w:rPr>
-        <w:t>2. The session is ended and the user must sign in again with the passcode.</w:t>
+        <w:t>2. Only simple signed in and expiry flags are kept locally; the passcode is never stored</w:t>
       </w:r>
     </w:p>
     <w:p>
       <w:pPr>
         <w:spacing w:before="0" w:after="40"/>
-        <w:ind w:left="360" w:hanging="240"/>
+        <w:ind w:left="1080" w:hanging="240"/>
       </w:pPr>
       <w:r>
         <w:rPr>
@@ -1487,22 +1183,22 @@
           <w:sz w:val="20"/>
           <w:u w:val="none"/>
         </w:rPr>
-        <w:t>3. The protected screens are no longer accessible until the user logs in again.</w:t>
+        <w:t>3. The app returns to the login screen</w:t>
       </w:r>
     </w:p>
     <w:p>
       <w:pPr>
-        <w:spacing w:before="120" w:after="60"/>
+        <w:spacing w:before="160" w:after="80"/>
       </w:pPr>
       <w:r>
         <w:rPr>
           <w:rFonts w:ascii="Arial" w:hAnsi="Arial" w:eastAsia="Arial" w:cs="Arial"/>
           <w:b/>
           <w:color w:val="001EFF"/>
-          <w:sz w:val="22"/>
+          <w:sz w:val="24"/>
           <w:u w:val="none"/>
         </w:rPr>
-        <w:t>3.2.Network briefly unavailable during refresh check keeps an existing valid session when possible</w:t>
+        <w:t>F4. Verify Protected Screens Require Login and Setup Remains Accessible</w:t>
       </w:r>
     </w:p>
     <w:p>
@@ -1523,7 +1219,7 @@
     <w:p>
       <w:pPr>
         <w:spacing w:before="0" w:after="40"/>
-        <w:ind w:left="360" w:hanging="240"/>
+        <w:ind w:left="1080" w:hanging="240"/>
       </w:pPr>
       <w:r>
         <w:rPr>
@@ -1533,23 +1229,7 @@
           <w:sz w:val="20"/>
           <w:u w:val="none"/>
         </w:rPr>
-        <w:t>1. The KDS device is successfully logged in and the session is still valid.</w:t>
-      </w:r>
-    </w:p>
-    <w:p>
-      <w:pPr>
-        <w:spacing w:before="0" w:after="40"/>
-        <w:ind w:left="360" w:hanging="240"/>
-      </w:pPr>
-      <w:r>
-        <w:rPr>
-          <w:rFonts w:ascii="Arial" w:hAnsi="Arial" w:eastAsia="Arial" w:cs="Arial"/>
-          <w:b w:val="0"/>
-          <w:color w:val="000000"/>
-          <w:sz w:val="20"/>
-          <w:u w:val="none"/>
-        </w:rPr>
-        <w:t>2. The network can be briefly disconnected during a refresh check.</w:t>
+        <w:t>1. The KDS device is signed out</w:t>
       </w:r>
     </w:p>
     <w:p>
@@ -1570,7 +1250,7 @@
     <w:p>
       <w:pPr>
         <w:spacing w:before="0" w:after="40"/>
-        <w:ind w:left="360" w:hanging="240"/>
+        <w:ind w:left="1080" w:hanging="240"/>
       </w:pPr>
       <w:r>
         <w:rPr>
@@ -1580,13 +1260,13 @@
           <w:sz w:val="20"/>
           <w:u w:val="none"/>
         </w:rPr>
-        <w:t>1. After a successful login, briefly disconnect the network.</w:t>
+        <w:t>1. Attempt to open a protected screen such as the tickets screen directly</w:t>
       </w:r>
     </w:p>
     <w:p>
       <w:pPr>
         <w:spacing w:before="0" w:after="40"/>
-        <w:ind w:left="360" w:hanging="240"/>
+        <w:ind w:left="1080" w:hanging="240"/>
       </w:pPr>
       <w:r>
         <w:rPr>
@@ -1596,23 +1276,7 @@
           <w:sz w:val="20"/>
           <w:u w:val="none"/>
         </w:rPr>
-        <w:t>2. Refresh the browser while the network is briefly unavailable.</w:t>
-      </w:r>
-    </w:p>
-    <w:p>
-      <w:pPr>
-        <w:spacing w:before="0" w:after="40"/>
-        <w:ind w:left="360" w:hanging="240"/>
-      </w:pPr>
-      <w:r>
-        <w:rPr>
-          <w:rFonts w:ascii="Arial" w:hAnsi="Arial" w:eastAsia="Arial" w:cs="Arial"/>
-          <w:b w:val="0"/>
-          <w:color w:val="000000"/>
-          <w:sz w:val="20"/>
-          <w:u w:val="none"/>
-        </w:rPr>
-        <w:t>3. Restore the network and verify the device behavior.</w:t>
+        <w:t>2. Attempt to open the setup page and login page</w:t>
       </w:r>
     </w:p>
     <w:p>
@@ -1633,7 +1297,7 @@
     <w:p>
       <w:pPr>
         <w:spacing w:before="0" w:after="40"/>
-        <w:ind w:left="360" w:hanging="240"/>
+        <w:ind w:left="1080" w:hanging="240"/>
       </w:pPr>
       <w:r>
         <w:rPr>
@@ -1643,13 +1307,13 @@
           <w:sz w:val="20"/>
           <w:u w:val="none"/>
         </w:rPr>
-        <w:t>1. When the network is briefly unavailable during the refresh check, the app keeps the existing valid session when possible.</w:t>
+        <w:t>1. Access to protected screens is denied and the user is redirected to the login screen</w:t>
       </w:r>
     </w:p>
     <w:p>
       <w:pPr>
         <w:spacing w:before="0" w:after="40"/>
-        <w:ind w:left="360" w:hanging="240"/>
+        <w:ind w:left="1080" w:hanging="240"/>
       </w:pPr>
       <w:r>
         <w:rPr>
@@ -1659,13 +1323,13 @@
           <w:sz w:val="20"/>
           <w:u w:val="none"/>
         </w:rPr>
-        <w:t>2. The user is not immediately logged out due to a brief network interruption.</w:t>
+        <w:t>2. The setup and login pages remain accessible while logged out</w:t>
       </w:r>
     </w:p>
     <w:p>
       <w:pPr>
         <w:spacing w:before="0" w:after="40"/>
-        <w:ind w:left="360" w:hanging="240"/>
+        <w:ind w:left="1080" w:hanging="240"/>
       </w:pPr>
       <w:r>
         <w:rPr>
@@ -1675,7 +1339,7 @@
           <w:sz w:val="20"/>
           <w:u w:val="none"/>
         </w:rPr>
-        <w:t>3. After the network is restored, the session continues to be valid and the ticket page is shown.</w:t>
+        <w:t>3. When the server returns unauthorized during use, the user is sent back to the login screen</w:t>
       </w:r>
     </w:p>
     <w:p>
@@ -1690,22 +1354,7 @@
           <w:sz w:val="24"/>
           <w:u w:val="none"/>
         </w:rPr>
-        <w:t>4.Post-Login Setup - Handshake and Device Sync</w:t>
-      </w:r>
-    </w:p>
-    <w:p>
-      <w:pPr>
-        <w:spacing w:before="120" w:after="60"/>
-      </w:pPr>
-      <w:r>
-        <w:rPr>
-          <w:rFonts w:ascii="Arial" w:hAnsi="Arial" w:eastAsia="Arial" w:cs="Arial"/>
-          <w:b/>
-          <w:color w:val="001EFF"/>
-          <w:sz w:val="22"/>
-          <w:u w:val="none"/>
-        </w:rPr>
-        <w:t>4.1.Successful handshake and device sync opens the ticket page</w:t>
+        <w:t>F5. Verify Changing Tenant ID, Device UID or Region Forces Login Again</w:t>
       </w:r>
     </w:p>
     <w:p>
@@ -1726,7 +1375,7 @@
     <w:p>
       <w:pPr>
         <w:spacing w:before="0" w:after="40"/>
-        <w:ind w:left="360" w:hanging="240"/>
+        <w:ind w:left="1080" w:hanging="240"/>
       </w:pPr>
       <w:r>
         <w:rPr>
@@ -1736,23 +1385,7 @@
           <w:sz w:val="20"/>
           <w:u w:val="none"/>
         </w:rPr>
-        <w:t>1. The KDS device is successfully logged in with the correct passcode.</w:t>
-      </w:r>
-    </w:p>
-    <w:p>
-      <w:pPr>
-        <w:spacing w:before="0" w:after="40"/>
-        <w:ind w:left="360" w:hanging="240"/>
-      </w:pPr>
-      <w:r>
-        <w:rPr>
-          <w:rFonts w:ascii="Arial" w:hAnsi="Arial" w:eastAsia="Arial" w:cs="Arial"/>
-          <w:b w:val="0"/>
-          <w:color w:val="000000"/>
-          <w:sz w:val="20"/>
-          <w:u w:val="none"/>
-        </w:rPr>
-        <w:t>2. The server is reachable and the handshake and device sync can complete successfully.</w:t>
+        <w:t>1. The KDS device is logged in</w:t>
       </w:r>
     </w:p>
     <w:p>
@@ -1773,7 +1406,7 @@
     <w:p>
       <w:pPr>
         <w:spacing w:before="0" w:after="40"/>
-        <w:ind w:left="360" w:hanging="240"/>
+        <w:ind w:left="1080" w:hanging="240"/>
       </w:pPr>
       <w:r>
         <w:rPr>
@@ -1783,13 +1416,13 @@
           <w:sz w:val="20"/>
           <w:u w:val="none"/>
         </w:rPr>
-        <w:t>1. Enter the correct passcode and submit.</w:t>
+        <w:t>1. Open device settings while signed in and change the Tenant ID, Device UID or region</w:t>
       </w:r>
     </w:p>
     <w:p>
       <w:pPr>
         <w:spacing w:before="0" w:after="40"/>
-        <w:ind w:left="360" w:hanging="240"/>
+        <w:ind w:left="1080" w:hanging="240"/>
       </w:pPr>
       <w:r>
         <w:rPr>
@@ -1799,39 +1432,7 @@
           <w:sz w:val="20"/>
           <w:u w:val="none"/>
         </w:rPr>
-        <w:t>2. Observe the app verifying the device session.</w:t>
-      </w:r>
-    </w:p>
-    <w:p>
-      <w:pPr>
-        <w:spacing w:before="0" w:after="40"/>
-        <w:ind w:left="360" w:hanging="240"/>
-      </w:pPr>
-      <w:r>
-        <w:rPr>
-          <w:rFonts w:ascii="Arial" w:hAnsi="Arial" w:eastAsia="Arial" w:cs="Arial"/>
-          <w:b w:val="0"/>
-          <w:color w:val="000000"/>
-          <w:sz w:val="20"/>
-          <w:u w:val="none"/>
-        </w:rPr>
-        <w:t>3. Observe the handshake and device sync process.</w:t>
-      </w:r>
-    </w:p>
-    <w:p>
-      <w:pPr>
-        <w:spacing w:before="0" w:after="40"/>
-        <w:ind w:left="360" w:hanging="240"/>
-      </w:pPr>
-      <w:r>
-        <w:rPr>
-          <w:rFonts w:ascii="Arial" w:hAnsi="Arial" w:eastAsia="Arial" w:cs="Arial"/>
-          <w:b w:val="0"/>
-          <w:color w:val="000000"/>
-          <w:sz w:val="20"/>
-          <w:u w:val="none"/>
-        </w:rPr>
-        <w:t>4. Verify the ticket page is shown after setup completes.</w:t>
+        <w:t>2. Save the change and observe the client</w:t>
       </w:r>
     </w:p>
     <w:p>
@@ -1852,7 +1453,7 @@
     <w:p>
       <w:pPr>
         <w:spacing w:before="0" w:after="40"/>
-        <w:ind w:left="360" w:hanging="240"/>
+        <w:ind w:left="1080" w:hanging="240"/>
       </w:pPr>
       <w:r>
         <w:rPr>
@@ -1862,13 +1463,13 @@
           <w:sz w:val="20"/>
           <w:u w:val="none"/>
         </w:rPr>
-        <w:t>1. After a successful login, the app runs the handshake and device sync.</w:t>
+        <w:t>1. The login session is cleared, together with related device data as required</w:t>
       </w:r>
     </w:p>
     <w:p>
       <w:pPr>
         <w:spacing w:before="0" w:after="40"/>
-        <w:ind w:left="360" w:hanging="240"/>
+        <w:ind w:left="1080" w:hanging="240"/>
       </w:pPr>
       <w:r>
         <w:rPr>
@@ -1878,13 +1479,13 @@
           <w:sz w:val="20"/>
           <w:u w:val="none"/>
         </w:rPr>
-        <w:t>2. The initial setup completes successfully.</w:t>
+        <w:t>2. The device is logged out and must sign in again with the passcode</w:t>
       </w:r>
     </w:p>
     <w:p>
       <w:pPr>
         <w:spacing w:before="0" w:after="40"/>
-        <w:ind w:left="360" w:hanging="240"/>
+        <w:ind w:left="1080" w:hanging="240"/>
       </w:pPr>
       <w:r>
         <w:rPr>
@@ -1894,23 +1495,22 @@
           <w:sz w:val="20"/>
           <w:u w:val="none"/>
         </w:rPr>
-        <w:t>3. The ticket page is shown after the setup finishes.</w:t>
+        <w:t>3. Tickets are not shown until login and initial setup are completed again</w:t>
       </w:r>
     </w:p>
     <w:p>
       <w:pPr>
-        <w:spacing w:before="0" w:after="40"/>
-        <w:ind w:left="360" w:hanging="240"/>
+        <w:spacing w:before="160" w:after="80"/>
       </w:pPr>
       <w:r>
         <w:rPr>
           <w:rFonts w:ascii="Arial" w:hAnsi="Arial" w:eastAsia="Arial" w:cs="Arial"/>
-          <w:b w:val="0"/>
-          <w:color w:val="000000"/>
-          <w:sz w:val="20"/>
+          <w:b/>
+          <w:color w:val="001EFF"/>
+          <w:sz w:val="24"/>
           <w:u w:val="none"/>
         </w:rPr>
-        <w:t>4. The user can interact with the tickets on the KDS device.</w:t>
+        <w:t>F6. Exception Handling</w:t>
       </w:r>
     </w:p>
     <w:p>
@@ -1925,7 +1525,7 @@
           <w:sz w:val="22"/>
           <w:u w:val="none"/>
         </w:rPr>
-        <w:t>4.2.Post-login setup failure logs the user out and allows retry</w:t>
+        <w:t>F6.1. Brief Network Unavailability During Refresh Session Check</w:t>
       </w:r>
     </w:p>
     <w:p>
@@ -1946,7 +1546,7 @@
     <w:p>
       <w:pPr>
         <w:spacing w:before="0" w:after="40"/>
-        <w:ind w:left="360" w:hanging="240"/>
+        <w:ind w:left="1080" w:hanging="240"/>
       </w:pPr>
       <w:r>
         <w:rPr>
@@ -1956,23 +1556,7 @@
           <w:sz w:val="20"/>
           <w:u w:val="none"/>
         </w:rPr>
-        <w:t>1. The KDS device is successfully logged in with the correct passcode.</w:t>
-      </w:r>
-    </w:p>
-    <w:p>
-      <w:pPr>
-        <w:spacing w:before="0" w:after="40"/>
-        <w:ind w:left="360" w:hanging="240"/>
-      </w:pPr>
-      <w:r>
-        <w:rPr>
-          <w:rFonts w:ascii="Arial" w:hAnsi="Arial" w:eastAsia="Arial" w:cs="Arial"/>
-          <w:b w:val="0"/>
-          <w:color w:val="000000"/>
-          <w:sz w:val="20"/>
-          <w:u w:val="none"/>
-        </w:rPr>
-        <w:t>2. The handshake or device sync can be made to fail (e.g., server error during setup).</w:t>
+        <w:t>1. The device has an existing valid session</w:t>
       </w:r>
     </w:p>
     <w:p>
@@ -1993,7 +1577,7 @@
     <w:p>
       <w:pPr>
         <w:spacing w:before="0" w:after="40"/>
-        <w:ind w:left="360" w:hanging="240"/>
+        <w:ind w:left="1080" w:hanging="240"/>
       </w:pPr>
       <w:r>
         <w:rPr>
@@ -2003,13 +1587,13 @@
           <w:sz w:val="20"/>
           <w:u w:val="none"/>
         </w:rPr>
-        <w:t>1. Enter the correct passcode and submit.</w:t>
+        <w:t>1. Make the network briefly unavailable during a page refresh session check</w:t>
       </w:r>
     </w:p>
     <w:p>
       <w:pPr>
         <w:spacing w:before="0" w:after="40"/>
-        <w:ind w:left="360" w:hanging="240"/>
+        <w:ind w:left="1080" w:hanging="240"/>
       </w:pPr>
       <w:r>
         <w:rPr>
@@ -2019,23 +1603,7 @@
           <w:sz w:val="20"/>
           <w:u w:val="none"/>
         </w:rPr>
-        <w:t>2. Trigger a failure in the handshake or device sync (e.g., simulate a server error during setup).</w:t>
-      </w:r>
-    </w:p>
-    <w:p>
-      <w:pPr>
-        <w:spacing w:before="0" w:after="40"/>
-        <w:ind w:left="360" w:hanging="240"/>
-      </w:pPr>
-      <w:r>
-        <w:rPr>
-          <w:rFonts w:ascii="Arial" w:hAnsi="Arial" w:eastAsia="Arial" w:cs="Arial"/>
-          <w:b w:val="0"/>
-          <w:color w:val="000000"/>
-          <w:sz w:val="20"/>
-          <w:u w:val="none"/>
-        </w:rPr>
-        <w:t>3. Verify the device behavior when the post-login setup fails.</w:t>
+        <w:t>2. Restore the network</w:t>
       </w:r>
     </w:p>
     <w:p>
@@ -2056,7 +1624,7 @@
     <w:p>
       <w:pPr>
         <w:spacing w:before="0" w:after="40"/>
-        <w:ind w:left="360" w:hanging="240"/>
+        <w:ind w:left="1080" w:hanging="240"/>
       </w:pPr>
       <w:r>
         <w:rPr>
@@ -2066,13 +1634,13 @@
           <w:sz w:val="20"/>
           <w:u w:val="none"/>
         </w:rPr>
-        <w:t>1. If the post-login setup (handshake or device sync) fails, the user is logged out.</w:t>
+        <w:t>1. The existing valid session is kept whenever possible</w:t>
       </w:r>
     </w:p>
     <w:p>
       <w:pPr>
         <w:spacing w:before="0" w:after="40"/>
-        <w:ind w:left="360" w:hanging="240"/>
+        <w:ind w:left="1080" w:hanging="240"/>
       </w:pPr>
       <w:r>
         <w:rPr>
@@ -2082,54 +1650,7 @@
           <w:sz w:val="20"/>
           <w:u w:val="none"/>
         </w:rPr>
-        <w:t>2. The login screen is shown again, allowing the user to try again.</w:t>
-      </w:r>
-    </w:p>
-    <w:p>
-      <w:pPr>
-        <w:spacing w:before="0" w:after="40"/>
-        <w:ind w:left="360" w:hanging="240"/>
-      </w:pPr>
-      <w:r>
-        <w:rPr>
-          <w:rFonts w:ascii="Arial" w:hAnsi="Arial" w:eastAsia="Arial" w:cs="Arial"/>
-          <w:b w:val="0"/>
-          <w:color w:val="000000"/>
-          <w:sz w:val="20"/>
-          <w:u w:val="none"/>
-        </w:rPr>
-        <w:t>3. The device does not show the ticket page when the setup fails.</w:t>
-      </w:r>
-    </w:p>
-    <w:p>
-      <w:pPr>
-        <w:spacing w:before="0" w:after="40"/>
-        <w:ind w:left="360" w:hanging="240"/>
-      </w:pPr>
-      <w:r>
-        <w:rPr>
-          <w:rFonts w:ascii="Arial" w:hAnsi="Arial" w:eastAsia="Arial" w:cs="Arial"/>
-          <w:b w:val="0"/>
-          <w:color w:val="000000"/>
-          <w:sz w:val="20"/>
-          <w:u w:val="none"/>
-        </w:rPr>
-        <w:t>4. The user can retry the login after the setup issue is resolved.</w:t>
-      </w:r>
-    </w:p>
-    <w:p>
-      <w:pPr>
-        <w:spacing w:before="160" w:after="80"/>
-      </w:pPr>
-      <w:r>
-        <w:rPr>
-          <w:rFonts w:ascii="Arial" w:hAnsi="Arial" w:eastAsia="Arial" w:cs="Arial"/>
-          <w:b/>
-          <w:color w:val="001EFF"/>
-          <w:sz w:val="24"/>
-          <w:u w:val="none"/>
-        </w:rPr>
-        <w:t>5.Protected Screens and Logout</w:t>
+        <w:t>2. The user is not incorrectly logged out due to the temporary network failure</w:t>
       </w:r>
     </w:p>
     <w:p>
@@ -2144,7 +1665,7 @@
           <w:sz w:val="22"/>
           <w:u w:val="none"/>
         </w:rPr>
-        <w:t>5.1.Protected screens require login and setup/login pages remain available when logged out</w:t>
+        <w:t>F6.2. Post Login Setup Failure</w:t>
       </w:r>
     </w:p>
     <w:p>
@@ -2165,7 +1686,7 @@
     <w:p>
       <w:pPr>
         <w:spacing w:before="0" w:after="40"/>
-        <w:ind w:left="360" w:hanging="240"/>
+        <w:ind w:left="1080" w:hanging="240"/>
       </w:pPr>
       <w:r>
         <w:rPr>
@@ -2175,7 +1696,7 @@
           <w:sz w:val="20"/>
           <w:u w:val="none"/>
         </w:rPr>
-        <w:t>1. The KDS device is logged out (no active session).</w:t>
+        <w:t>1. Passcode login succeeds but handshake or device sync can fail</w:t>
       </w:r>
     </w:p>
     <w:p>
@@ -2196,7 +1717,7 @@
     <w:p>
       <w:pPr>
         <w:spacing w:before="0" w:after="40"/>
-        <w:ind w:left="360" w:hanging="240"/>
+        <w:ind w:left="1080" w:hanging="240"/>
       </w:pPr>
       <w:r>
         <w:rPr>
@@ -2206,13 +1727,13 @@
           <w:sz w:val="20"/>
           <w:u w:val="none"/>
         </w:rPr>
-        <w:t>1. Open the KDS web client while logged out.</w:t>
+        <w:t>1. Log in with the correct passcode while the post-login setup endpoint fails</w:t>
       </w:r>
     </w:p>
     <w:p>
       <w:pPr>
         <w:spacing w:before="0" w:after="40"/>
-        <w:ind w:left="360" w:hanging="240"/>
+        <w:ind w:left="1080" w:hanging="240"/>
       </w:pPr>
       <w:r>
         <w:rPr>
@@ -2222,39 +1743,7 @@
           <w:sz w:val="20"/>
           <w:u w:val="none"/>
         </w:rPr>
-        <w:t>2. Attempt to access a protected screen (e.g., the ticket page) directly.</w:t>
-      </w:r>
-    </w:p>
-    <w:p>
-      <w:pPr>
-        <w:spacing w:before="0" w:after="40"/>
-        <w:ind w:left="360" w:hanging="240"/>
-      </w:pPr>
-      <w:r>
-        <w:rPr>
-          <w:rFonts w:ascii="Arial" w:hAnsi="Arial" w:eastAsia="Arial" w:cs="Arial"/>
-          <w:b w:val="0"/>
-          <w:color w:val="000000"/>
-          <w:sz w:val="20"/>
-          <w:u w:val="none"/>
-        </w:rPr>
-        <w:t>3. Verify the behavior.</w:t>
-      </w:r>
-    </w:p>
-    <w:p>
-      <w:pPr>
-        <w:spacing w:before="0" w:after="40"/>
-        <w:ind w:left="360" w:hanging="240"/>
-      </w:pPr>
-      <w:r>
-        <w:rPr>
-          <w:rFonts w:ascii="Arial" w:hAnsi="Arial" w:eastAsia="Arial" w:cs="Arial"/>
-          <w:b w:val="0"/>
-          <w:color w:val="000000"/>
-          <w:sz w:val="20"/>
-          <w:u w:val="none"/>
-        </w:rPr>
-        <w:t>4. Verify that the setup (device settings) and login pages are accessible while logged out.</w:t>
+        <w:t>2. Observe the client state and retry login after the service is restored</w:t>
       </w:r>
     </w:p>
     <w:p>
@@ -2275,7 +1764,7 @@
     <w:p>
       <w:pPr>
         <w:spacing w:before="0" w:after="40"/>
-        <w:ind w:left="360" w:hanging="240"/>
+        <w:ind w:left="1080" w:hanging="240"/>
       </w:pPr>
       <w:r>
         <w:rPr>
@@ -2285,13 +1774,13 @@
           <w:sz w:val="20"/>
           <w:u w:val="none"/>
         </w:rPr>
-        <w:t>1. Protected screens (e.g., ticket page) require login and are not accessible when logged out.</w:t>
+        <w:t>1. The login is rolled back to the logged out state when post-login setup fails</w:t>
       </w:r>
     </w:p>
     <w:p>
       <w:pPr>
         <w:spacing w:before="0" w:after="40"/>
-        <w:ind w:left="360" w:hanging="240"/>
+        <w:ind w:left="1080" w:hanging="240"/>
       </w:pPr>
       <w:r>
         <w:rPr>
@@ -2301,13 +1790,13 @@
           <w:sz w:val="20"/>
           <w:u w:val="none"/>
         </w:rPr>
-        <w:t>2. The user is redirected to the login screen when attempting to access a protected screen while logged out.</w:t>
+        <w:t>2. The user can attempt login again</w:t>
       </w:r>
     </w:p>
     <w:p>
       <w:pPr>
         <w:spacing w:before="0" w:after="40"/>
-        <w:ind w:left="360" w:hanging="240"/>
+        <w:ind w:left="1080" w:hanging="240"/>
       </w:pPr>
       <w:r>
         <w:rPr>
@@ -2317,23 +1806,7 @@
           <w:sz w:val="20"/>
           <w:u w:val="none"/>
         </w:rPr>
-        <w:t>3. The setup (device settings) page remains available when logged out.</w:t>
-      </w:r>
-    </w:p>
-    <w:p>
-      <w:pPr>
-        <w:spacing w:before="0" w:after="40"/>
-        <w:ind w:left="360" w:hanging="240"/>
-      </w:pPr>
-      <w:r>
-        <w:rPr>
-          <w:rFonts w:ascii="Arial" w:hAnsi="Arial" w:eastAsia="Arial" w:cs="Arial"/>
-          <w:b w:val="0"/>
-          <w:color w:val="000000"/>
-          <w:sz w:val="20"/>
-          <w:u w:val="none"/>
-        </w:rPr>
-        <w:t>4. The login page remains available when logged out.</w:t>
+        <w:t>3. The tickets screen is never shown until handshake and device sync complete successfully</w:t>
       </w:r>
     </w:p>
     <w:p>
@@ -2348,7 +1821,7 @@
           <w:sz w:val="22"/>
           <w:u w:val="none"/>
         </w:rPr>
-        <w:t>5.2.Logout from the header revokes the server session and clears local login state</w:t>
+        <w:t>F6.3. Login Messages Translation</w:t>
       </w:r>
     </w:p>
     <w:p>
@@ -2369,7 +1842,7 @@
     <w:p>
       <w:pPr>
         <w:spacing w:before="0" w:after="40"/>
-        <w:ind w:left="360" w:hanging="240"/>
+        <w:ind w:left="1080" w:hanging="240"/>
       </w:pPr>
       <w:r>
         <w:rPr>
@@ -2379,7 +1852,7 @@
           <w:sz w:val="20"/>
           <w:u w:val="none"/>
         </w:rPr>
-        <w:t>1. The KDS device is successfully logged in and the session is active.</w:t>
+        <w:t>1. The KDS web client supports multiple display languages</w:t>
       </w:r>
     </w:p>
     <w:p>
@@ -2400,7 +1873,7 @@
     <w:p>
       <w:pPr>
         <w:spacing w:before="0" w:after="40"/>
-        <w:ind w:left="360" w:hanging="240"/>
+        <w:ind w:left="1080" w:hanging="240"/>
       </w:pPr>
       <w:r>
         <w:rPr>
@@ -2410,13 +1883,13 @@
           <w:sz w:val="20"/>
           <w:u w:val="none"/>
         </w:rPr>
-        <w:t>1. While on the ticket page, click the logout button in the header.</w:t>
+        <w:t>1. Switch the display language</w:t>
       </w:r>
     </w:p>
     <w:p>
       <w:pPr>
         <w:spacing w:before="0" w:after="40"/>
-        <w:ind w:left="360" w:hanging="240"/>
+        <w:ind w:left="1080" w:hanging="240"/>
       </w:pPr>
       <w:r>
         <w:rPr>
@@ -2426,7 +1899,7 @@
           <w:sz w:val="20"/>
           <w:u w:val="none"/>
         </w:rPr>
-        <w:t>2. Verify the device behavior after logout.</w:t>
+        <w:t>2. Trigger login success, incorrect passcode and network error scenarios</w:t>
       </w:r>
     </w:p>
     <w:p>
@@ -2447,7 +1920,7 @@
     <w:p>
       <w:pPr>
         <w:spacing w:before="0" w:after="40"/>
-        <w:ind w:left="360" w:hanging="240"/>
+        <w:ind w:left="1080" w:hanging="240"/>
       </w:pPr>
       <w:r>
         <w:rPr>
@@ -2457,13 +1930,13 @@
           <w:sz w:val="20"/>
           <w:u w:val="none"/>
         </w:rPr>
-        <w:t>1. Clicking logout from the header revokes the server session when possible.</w:t>
+        <w:t>1. Login labels and related messages are displayed in the selected language</w:t>
       </w:r>
     </w:p>
     <w:p>
       <w:pPr>
         <w:spacing w:before="0" w:after="40"/>
-        <w:ind w:left="360" w:hanging="240"/>
+        <w:ind w:left="1080" w:hanging="240"/>
       </w:pPr>
       <w:r>
         <w:rPr>
@@ -2473,792 +1946,7 @@
           <w:sz w:val="20"/>
           <w:u w:val="none"/>
         </w:rPr>
-        <w:t>2. The local login state (signed in / expiry flags) is cleared.</w:t>
-      </w:r>
-    </w:p>
-    <w:p>
-      <w:pPr>
-        <w:spacing w:before="0" w:after="40"/>
-        <w:ind w:left="360" w:hanging="240"/>
-      </w:pPr>
-      <w:r>
-        <w:rPr>
-          <w:rFonts w:ascii="Arial" w:hAnsi="Arial" w:eastAsia="Arial" w:cs="Arial"/>
-          <w:b w:val="0"/>
-          <w:color w:val="000000"/>
-          <w:sz w:val="20"/>
-          <w:u w:val="none"/>
-        </w:rPr>
-        <w:t>3. The user is returned to the login screen.</w:t>
-      </w:r>
-    </w:p>
-    <w:p>
-      <w:pPr>
-        <w:spacing w:before="0" w:after="40"/>
-        <w:ind w:left="360" w:hanging="240"/>
-      </w:pPr>
-      <w:r>
-        <w:rPr>
-          <w:rFonts w:ascii="Arial" w:hAnsi="Arial" w:eastAsia="Arial" w:cs="Arial"/>
-          <w:b w:val="0"/>
-          <w:color w:val="000000"/>
-          <w:sz w:val="20"/>
-          <w:u w:val="none"/>
-        </w:rPr>
-        <w:t>4. The passcode is not stored locally after logout.</w:t>
-      </w:r>
-    </w:p>
-    <w:p>
-      <w:pPr>
-        <w:spacing w:before="160" w:after="80"/>
-      </w:pPr>
-      <w:r>
-        <w:rPr>
-          <w:rFonts w:ascii="Arial" w:hAnsi="Arial" w:eastAsia="Arial" w:cs="Arial"/>
-          <w:b/>
-          <w:color w:val="001EFF"/>
-          <w:sz w:val="24"/>
-          <w:u w:val="none"/>
-        </w:rPr>
-        <w:t>6.Device Settings Change - Forced Re-Login</w:t>
-      </w:r>
-    </w:p>
-    <w:p>
-      <w:pPr>
-        <w:spacing w:before="120" w:after="60"/>
-      </w:pPr>
-      <w:r>
-        <w:rPr>
-          <w:rFonts w:ascii="Arial" w:hAnsi="Arial" w:eastAsia="Arial" w:cs="Arial"/>
-          <w:b/>
-          <w:color w:val="001EFF"/>
-          <w:sz w:val="22"/>
-          <w:u w:val="none"/>
-        </w:rPr>
-        <w:t>6.1.Changing Tenant ID, Device UID, or region logs the user out and requires login again</w:t>
-      </w:r>
-    </w:p>
-    <w:p>
-      <w:pPr>
-        <w:spacing w:before="0" w:after="80"/>
-      </w:pPr>
-      <w:r>
-        <w:rPr>
-          <w:rFonts w:ascii="Arial" w:hAnsi="Arial" w:eastAsia="Arial" w:cs="Arial"/>
-          <w:b/>
-          <w:color w:val="000000"/>
-          <w:sz w:val="20"/>
-          <w:u w:val="none"/>
-        </w:rPr>
-        <w:t>Prerequisite(s):</w:t>
-      </w:r>
-    </w:p>
-    <w:p>
-      <w:pPr>
-        <w:spacing w:before="0" w:after="40"/>
-        <w:ind w:left="360" w:hanging="240"/>
-      </w:pPr>
-      <w:r>
-        <w:rPr>
-          <w:rFonts w:ascii="Arial" w:hAnsi="Arial" w:eastAsia="Arial" w:cs="Arial"/>
-          <w:b w:val="0"/>
-          <w:color w:val="000000"/>
-          <w:sz w:val="20"/>
-          <w:u w:val="none"/>
-        </w:rPr>
-        <w:t>1. The KDS device is successfully logged in and the session is active.</w:t>
-      </w:r>
-    </w:p>
-    <w:p>
-      <w:pPr>
-        <w:spacing w:before="0" w:after="40"/>
-        <w:ind w:left="360" w:hanging="240"/>
-      </w:pPr>
-      <w:r>
-        <w:rPr>
-          <w:rFonts w:ascii="Arial" w:hAnsi="Arial" w:eastAsia="Arial" w:cs="Arial"/>
-          <w:b w:val="0"/>
-          <w:color w:val="000000"/>
-          <w:sz w:val="20"/>
-          <w:u w:val="none"/>
-        </w:rPr>
-        <w:t>2. The device settings (Tenant ID, Device UID, region) can be changed.</w:t>
-      </w:r>
-    </w:p>
-    <w:p>
-      <w:pPr>
-        <w:spacing w:before="0" w:after="80"/>
-      </w:pPr>
-      <w:r>
-        <w:rPr>
-          <w:rFonts w:ascii="Arial" w:hAnsi="Arial" w:eastAsia="Arial" w:cs="Arial"/>
-          <w:b/>
-          <w:color w:val="000000"/>
-          <w:sz w:val="20"/>
-          <w:u w:val="none"/>
-        </w:rPr>
-        <w:t>Step(s):</w:t>
-      </w:r>
-    </w:p>
-    <w:p>
-      <w:pPr>
-        <w:spacing w:before="0" w:after="40"/>
-        <w:ind w:left="360" w:hanging="240"/>
-      </w:pPr>
-      <w:r>
-        <w:rPr>
-          <w:rFonts w:ascii="Arial" w:hAnsi="Arial" w:eastAsia="Arial" w:cs="Arial"/>
-          <w:b w:val="0"/>
-          <w:color w:val="000000"/>
-          <w:sz w:val="20"/>
-          <w:u w:val="none"/>
-        </w:rPr>
-        <w:t>1. While logged in, open the device settings.</w:t>
-      </w:r>
-    </w:p>
-    <w:p>
-      <w:pPr>
-        <w:spacing w:before="0" w:after="40"/>
-        <w:ind w:left="360" w:hanging="240"/>
-      </w:pPr>
-      <w:r>
-        <w:rPr>
-          <w:rFonts w:ascii="Arial" w:hAnsi="Arial" w:eastAsia="Arial" w:cs="Arial"/>
-          <w:b w:val="0"/>
-          <w:color w:val="000000"/>
-          <w:sz w:val="20"/>
-          <w:u w:val="none"/>
-        </w:rPr>
-        <w:t>2. Change the Tenant ID.</w:t>
-      </w:r>
-    </w:p>
-    <w:p>
-      <w:pPr>
-        <w:spacing w:before="0" w:after="40"/>
-        <w:ind w:left="360" w:hanging="240"/>
-      </w:pPr>
-      <w:r>
-        <w:rPr>
-          <w:rFonts w:ascii="Arial" w:hAnsi="Arial" w:eastAsia="Arial" w:cs="Arial"/>
-          <w:b w:val="0"/>
-          <w:color w:val="000000"/>
-          <w:sz w:val="20"/>
-          <w:u w:val="none"/>
-        </w:rPr>
-        <w:t>3. Save the change and verify the device behavior.</w:t>
-      </w:r>
-    </w:p>
-    <w:p>
-      <w:pPr>
-        <w:spacing w:before="0" w:after="40"/>
-        <w:ind w:left="360" w:hanging="240"/>
-      </w:pPr>
-      <w:r>
-        <w:rPr>
-          <w:rFonts w:ascii="Arial" w:hAnsi="Arial" w:eastAsia="Arial" w:cs="Arial"/>
-          <w:b w:val="0"/>
-          <w:color w:val="000000"/>
-          <w:sz w:val="20"/>
-          <w:u w:val="none"/>
-        </w:rPr>
-        <w:t>4. Log back in, then change the Device UID and verify the behavior.</w:t>
-      </w:r>
-    </w:p>
-    <w:p>
-      <w:pPr>
-        <w:spacing w:before="0" w:after="40"/>
-        <w:ind w:left="360" w:hanging="240"/>
-      </w:pPr>
-      <w:r>
-        <w:rPr>
-          <w:rFonts w:ascii="Arial" w:hAnsi="Arial" w:eastAsia="Arial" w:cs="Arial"/>
-          <w:b w:val="0"/>
-          <w:color w:val="000000"/>
-          <w:sz w:val="20"/>
-          <w:u w:val="none"/>
-        </w:rPr>
-        <w:t>5. Log back in, then change the region and verify the behavior.</w:t>
-      </w:r>
-    </w:p>
-    <w:p>
-      <w:pPr>
-        <w:spacing w:before="0" w:after="80"/>
-      </w:pPr>
-      <w:r>
-        <w:rPr>
-          <w:rFonts w:ascii="Arial" w:hAnsi="Arial" w:eastAsia="Arial" w:cs="Arial"/>
-          <w:b/>
-          <w:color w:val="000000"/>
-          <w:sz w:val="20"/>
-          <w:u w:val="none"/>
-        </w:rPr>
-        <w:t>Test Result(s):</w:t>
-      </w:r>
-    </w:p>
-    <w:p>
-      <w:pPr>
-        <w:spacing w:before="0" w:after="40"/>
-        <w:ind w:left="360" w:hanging="240"/>
-      </w:pPr>
-      <w:r>
-        <w:rPr>
-          <w:rFonts w:ascii="Arial" w:hAnsi="Arial" w:eastAsia="Arial" w:cs="Arial"/>
-          <w:b w:val="0"/>
-          <w:color w:val="000000"/>
-          <w:sz w:val="20"/>
-          <w:u w:val="none"/>
-        </w:rPr>
-        <w:t>1. Changing the Tenant ID logs the user out and requires login again with the passcode.</w:t>
-      </w:r>
-    </w:p>
-    <w:p>
-      <w:pPr>
-        <w:spacing w:before="0" w:after="40"/>
-        <w:ind w:left="360" w:hanging="240"/>
-      </w:pPr>
-      <w:r>
-        <w:rPr>
-          <w:rFonts w:ascii="Arial" w:hAnsi="Arial" w:eastAsia="Arial" w:cs="Arial"/>
-          <w:b w:val="0"/>
-          <w:color w:val="000000"/>
-          <w:sz w:val="20"/>
-          <w:u w:val="none"/>
-        </w:rPr>
-        <w:t>2. Changing the Device UID logs the user out and requires login again with the passcode.</w:t>
-      </w:r>
-    </w:p>
-    <w:p>
-      <w:pPr>
-        <w:spacing w:before="0" w:after="40"/>
-        <w:ind w:left="360" w:hanging="240"/>
-      </w:pPr>
-      <w:r>
-        <w:rPr>
-          <w:rFonts w:ascii="Arial" w:hAnsi="Arial" w:eastAsia="Arial" w:cs="Arial"/>
-          <w:b w:val="0"/>
-          <w:color w:val="000000"/>
-          <w:sz w:val="20"/>
-          <w:u w:val="none"/>
-        </w:rPr>
-        <w:t>3. Changing the region logs the user out and requires login again with the passcode.</w:t>
-      </w:r>
-    </w:p>
-    <w:p>
-      <w:pPr>
-        <w:spacing w:before="0" w:after="40"/>
-        <w:ind w:left="360" w:hanging="240"/>
-      </w:pPr>
-      <w:r>
-        <w:rPr>
-          <w:rFonts w:ascii="Arial" w:hAnsi="Arial" w:eastAsia="Arial" w:cs="Arial"/>
-          <w:b w:val="0"/>
-          <w:color w:val="000000"/>
-          <w:sz w:val="20"/>
-          <w:u w:val="none"/>
-        </w:rPr>
-        <w:t>4. The login session and related device data are cleared when any of these settings change.</w:t>
-      </w:r>
-    </w:p>
-    <w:p>
-      <w:pPr>
-        <w:spacing w:before="160" w:after="80"/>
-      </w:pPr>
-      <w:r>
-        <w:rPr>
-          <w:rFonts w:ascii="Arial" w:hAnsi="Arial" w:eastAsia="Arial" w:cs="Arial"/>
-          <w:b/>
-          <w:color w:val="001EFF"/>
-          <w:sz w:val="24"/>
-          <w:u w:val="none"/>
-        </w:rPr>
-        <w:t>7.Passcode Setup and Synchronization</w:t>
-      </w:r>
-    </w:p>
-    <w:p>
-      <w:pPr>
-        <w:spacing w:before="120" w:after="60"/>
-      </w:pPr>
-      <w:r>
-        <w:rPr>
-          <w:rFonts w:ascii="Arial" w:hAnsi="Arial" w:eastAsia="Arial" w:cs="Arial"/>
-          <w:b/>
-          <w:color w:val="001EFF"/>
-          <w:sz w:val="22"/>
-          <w:u w:val="none"/>
-        </w:rPr>
-        <w:t>7.1.Set and update the device passcode in KDS Device Setup</w:t>
-      </w:r>
-    </w:p>
-    <w:p>
-      <w:pPr>
-        <w:spacing w:before="0" w:after="80"/>
-      </w:pPr>
-      <w:r>
-        <w:rPr>
-          <w:rFonts w:ascii="Arial" w:hAnsi="Arial" w:eastAsia="Arial" w:cs="Arial"/>
-          <w:b/>
-          <w:color w:val="000000"/>
-          <w:sz w:val="20"/>
-          <w:u w:val="none"/>
-        </w:rPr>
-        <w:t>Prerequisite(s):</w:t>
-      </w:r>
-    </w:p>
-    <w:p>
-      <w:pPr>
-        <w:spacing w:before="0" w:after="40"/>
-        <w:ind w:left="360" w:hanging="240"/>
-      </w:pPr>
-      <w:r>
-        <w:rPr>
-          <w:rFonts w:ascii="Arial" w:hAnsi="Arial" w:eastAsia="Arial" w:cs="Arial"/>
-          <w:b w:val="0"/>
-          <w:color w:val="000000"/>
-          <w:sz w:val="20"/>
-          <w:u w:val="none"/>
-        </w:rPr>
-        <w:t>1. Access to Infrasys Cloud Admin page is available.</w:t>
-      </w:r>
-    </w:p>
-    <w:p>
-      <w:pPr>
-        <w:spacing w:before="0" w:after="40"/>
-        <w:ind w:left="360" w:hanging="240"/>
-      </w:pPr>
-      <w:r>
-        <w:rPr>
-          <w:rFonts w:ascii="Arial" w:hAnsi="Arial" w:eastAsia="Arial" w:cs="Arial"/>
-          <w:b w:val="0"/>
-          <w:color w:val="000000"/>
-          <w:sz w:val="20"/>
-          <w:u w:val="none"/>
-        </w:rPr>
-        <w:t>2. The KDS device is registered in Kitchen Display System &gt; Device Setup &gt; Devices.</w:t>
-      </w:r>
-    </w:p>
-    <w:p>
-      <w:pPr>
-        <w:spacing w:before="0" w:after="80"/>
-      </w:pPr>
-      <w:r>
-        <w:rPr>
-          <w:rFonts w:ascii="Arial" w:hAnsi="Arial" w:eastAsia="Arial" w:cs="Arial"/>
-          <w:b/>
-          <w:color w:val="000000"/>
-          <w:sz w:val="20"/>
-          <w:u w:val="none"/>
-        </w:rPr>
-        <w:t>Step(s):</w:t>
-      </w:r>
-    </w:p>
-    <w:p>
-      <w:pPr>
-        <w:spacing w:before="0" w:after="40"/>
-        <w:ind w:left="360" w:hanging="240"/>
-      </w:pPr>
-      <w:r>
-        <w:rPr>
-          <w:rFonts w:ascii="Arial" w:hAnsi="Arial" w:eastAsia="Arial" w:cs="Arial"/>
-          <w:b w:val="0"/>
-          <w:color w:val="000000"/>
-          <w:sz w:val="20"/>
-          <w:u w:val="none"/>
-        </w:rPr>
-        <w:t>1. Go to Kitchen Display System &gt; Device Setup &gt; Devices.</w:t>
-      </w:r>
-    </w:p>
-    <w:p>
-      <w:pPr>
-        <w:spacing w:before="0" w:after="40"/>
-        <w:ind w:left="360" w:hanging="240"/>
-      </w:pPr>
-      <w:r>
-        <w:rPr>
-          <w:rFonts w:ascii="Arial" w:hAnsi="Arial" w:eastAsia="Arial" w:cs="Arial"/>
-          <w:b w:val="0"/>
-          <w:color w:val="000000"/>
-          <w:sz w:val="20"/>
-          <w:u w:val="none"/>
-        </w:rPr>
-        <w:t>2. Edit the target device.</w:t>
-      </w:r>
-    </w:p>
-    <w:p>
-      <w:pPr>
-        <w:spacing w:before="0" w:after="40"/>
-        <w:ind w:left="360" w:hanging="240"/>
-      </w:pPr>
-      <w:r>
-        <w:rPr>
-          <w:rFonts w:ascii="Arial" w:hAnsi="Arial" w:eastAsia="Arial" w:cs="Arial"/>
-          <w:b w:val="0"/>
-          <w:color w:val="000000"/>
-          <w:sz w:val="20"/>
-          <w:u w:val="none"/>
-        </w:rPr>
-        <w:t>3. Set or update the device passcode.</w:t>
-      </w:r>
-    </w:p>
-    <w:p>
-      <w:pPr>
-        <w:spacing w:before="0" w:after="40"/>
-        <w:ind w:left="360" w:hanging="240"/>
-      </w:pPr>
-      <w:r>
-        <w:rPr>
-          <w:rFonts w:ascii="Arial" w:hAnsi="Arial" w:eastAsia="Arial" w:cs="Arial"/>
-          <w:b w:val="0"/>
-          <w:color w:val="000000"/>
-          <w:sz w:val="20"/>
-          <w:u w:val="none"/>
-        </w:rPr>
-        <w:t>4. Click "Save".</w:t>
-      </w:r>
-    </w:p>
-    <w:p>
-      <w:pPr>
-        <w:spacing w:before="0" w:after="40"/>
-        <w:ind w:left="360" w:hanging="240"/>
-      </w:pPr>
-      <w:r>
-        <w:rPr>
-          <w:rFonts w:ascii="Arial" w:hAnsi="Arial" w:eastAsia="Arial" w:cs="Arial"/>
-          <w:b w:val="0"/>
-          <w:color w:val="000000"/>
-          <w:sz w:val="20"/>
-          <w:u w:val="none"/>
-        </w:rPr>
-        <w:t>5. Verify the updated passcode is synchronized to the KDS device.</w:t>
-      </w:r>
-    </w:p>
-    <w:p>
-      <w:pPr>
-        <w:spacing w:before="0" w:after="80"/>
-      </w:pPr>
-      <w:r>
-        <w:rPr>
-          <w:rFonts w:ascii="Arial" w:hAnsi="Arial" w:eastAsia="Arial" w:cs="Arial"/>
-          <w:b/>
-          <w:color w:val="000000"/>
-          <w:sz w:val="20"/>
-          <w:u w:val="none"/>
-        </w:rPr>
-        <w:t>Test Result(s):</w:t>
-      </w:r>
-    </w:p>
-    <w:p>
-      <w:pPr>
-        <w:spacing w:before="0" w:after="40"/>
-        <w:ind w:left="360" w:hanging="240"/>
-      </w:pPr>
-      <w:r>
-        <w:rPr>
-          <w:rFonts w:ascii="Arial" w:hAnsi="Arial" w:eastAsia="Arial" w:cs="Arial"/>
-          <w:b w:val="0"/>
-          <w:color w:val="000000"/>
-          <w:sz w:val="20"/>
-          <w:u w:val="none"/>
-        </w:rPr>
-        <w:t>1. The device passcode is set or updated successfully in the Device Setup.</w:t>
-      </w:r>
-    </w:p>
-    <w:p>
-      <w:pPr>
-        <w:spacing w:before="0" w:after="40"/>
-        <w:ind w:left="360" w:hanging="240"/>
-      </w:pPr>
-      <w:r>
-        <w:rPr>
-          <w:rFonts w:ascii="Arial" w:hAnsi="Arial" w:eastAsia="Arial" w:cs="Arial"/>
-          <w:b w:val="0"/>
-          <w:color w:val="000000"/>
-          <w:sz w:val="20"/>
-          <w:u w:val="none"/>
-        </w:rPr>
-        <w:t>2. The updated passcode is synchronized to the KDS device.</w:t>
-      </w:r>
-    </w:p>
-    <w:p>
-      <w:pPr>
-        <w:spacing w:before="0" w:after="40"/>
-        <w:ind w:left="360" w:hanging="240"/>
-      </w:pPr>
-      <w:r>
-        <w:rPr>
-          <w:rFonts w:ascii="Arial" w:hAnsi="Arial" w:eastAsia="Arial" w:cs="Arial"/>
-          <w:b w:val="0"/>
-          <w:color w:val="000000"/>
-          <w:sz w:val="20"/>
-          <w:u w:val="none"/>
-        </w:rPr>
-        <w:t>3. The KDS device can log in using the updated passcode.</w:t>
-      </w:r>
-    </w:p>
-    <w:p>
-      <w:pPr>
-        <w:spacing w:before="0" w:after="40"/>
-        <w:ind w:left="360" w:hanging="240"/>
-      </w:pPr>
-      <w:r>
-        <w:rPr>
-          <w:rFonts w:ascii="Arial" w:hAnsi="Arial" w:eastAsia="Arial" w:cs="Arial"/>
-          <w:b w:val="0"/>
-          <w:color w:val="000000"/>
-          <w:sz w:val="20"/>
-          <w:u w:val="none"/>
-        </w:rPr>
-        <w:t>4. The old passcode (if changed) no longer works for login.</w:t>
-      </w:r>
-    </w:p>
-    <w:p>
-      <w:pPr>
-        <w:spacing w:before="160" w:after="80"/>
-      </w:pPr>
-      <w:r>
-        <w:rPr>
-          <w:rFonts w:ascii="Arial" w:hAnsi="Arial" w:eastAsia="Arial" w:cs="Arial"/>
-          <w:b/>
-          <w:color w:val="001EFF"/>
-          <w:sz w:val="24"/>
-          <w:u w:val="none"/>
-        </w:rPr>
-        <w:t>8.Localization - Login and Related Messages</w:t>
-      </w:r>
-    </w:p>
-    <w:p>
-      <w:pPr>
-        <w:spacing w:before="120" w:after="60"/>
-      </w:pPr>
-      <w:r>
-        <w:rPr>
-          <w:rFonts w:ascii="Arial" w:hAnsi="Arial" w:eastAsia="Arial" w:cs="Arial"/>
-          <w:b/>
-          <w:color w:val="001EFF"/>
-          <w:sz w:val="22"/>
-          <w:u w:val="none"/>
-        </w:rPr>
-        <w:t>8.1.Login screen and error messages are translated</w:t>
-      </w:r>
-    </w:p>
-    <w:p>
-      <w:pPr>
-        <w:spacing w:before="0" w:after="80"/>
-      </w:pPr>
-      <w:r>
-        <w:rPr>
-          <w:rFonts w:ascii="Arial" w:hAnsi="Arial" w:eastAsia="Arial" w:cs="Arial"/>
-          <w:b/>
-          <w:color w:val="000000"/>
-          <w:sz w:val="20"/>
-          <w:u w:val="none"/>
-        </w:rPr>
-        <w:t>Prerequisite(s):</w:t>
-      </w:r>
-    </w:p>
-    <w:p>
-      <w:pPr>
-        <w:spacing w:before="0" w:after="40"/>
-        <w:ind w:left="360" w:hanging="240"/>
-      </w:pPr>
-      <w:r>
-        <w:rPr>
-          <w:rFonts w:ascii="Arial" w:hAnsi="Arial" w:eastAsia="Arial" w:cs="Arial"/>
-          <w:b w:val="0"/>
-          <w:color w:val="000000"/>
-          <w:sz w:val="20"/>
-          <w:u w:val="none"/>
-        </w:rPr>
-        <w:t>1. The KDS device build containing the HERO-68915 feature is deployed.</w:t>
-      </w:r>
-    </w:p>
-    <w:p>
-      <w:pPr>
-        <w:spacing w:before="0" w:after="40"/>
-        <w:ind w:left="360" w:hanging="240"/>
-      </w:pPr>
-      <w:r>
-        <w:rPr>
-          <w:rFonts w:ascii="Arial" w:hAnsi="Arial" w:eastAsia="Arial" w:cs="Arial"/>
-          <w:b w:val="0"/>
-          <w:color w:val="000000"/>
-          <w:sz w:val="20"/>
-          <w:u w:val="none"/>
-        </w:rPr>
-        <w:t>2. Multiple languages are configured for the KDS device.</w:t>
-      </w:r>
-    </w:p>
-    <w:p>
-      <w:pPr>
-        <w:spacing w:before="0" w:after="80"/>
-      </w:pPr>
-      <w:r>
-        <w:rPr>
-          <w:rFonts w:ascii="Arial" w:hAnsi="Arial" w:eastAsia="Arial" w:cs="Arial"/>
-          <w:b/>
-          <w:color w:val="000000"/>
-          <w:sz w:val="20"/>
-          <w:u w:val="none"/>
-        </w:rPr>
-        <w:t>Step(s):</w:t>
-      </w:r>
-    </w:p>
-    <w:p>
-      <w:pPr>
-        <w:spacing w:before="0" w:after="40"/>
-        <w:ind w:left="360" w:hanging="240"/>
-      </w:pPr>
-      <w:r>
-        <w:rPr>
-          <w:rFonts w:ascii="Arial" w:hAnsi="Arial" w:eastAsia="Arial" w:cs="Arial"/>
-          <w:b w:val="0"/>
-          <w:color w:val="000000"/>
-          <w:sz w:val="20"/>
-          <w:u w:val="none"/>
-        </w:rPr>
-        <w:t>1. Open the KDS web client with one language configured.</w:t>
-      </w:r>
-    </w:p>
-    <w:p>
-      <w:pPr>
-        <w:spacing w:before="0" w:after="40"/>
-        <w:ind w:left="360" w:hanging="240"/>
-      </w:pPr>
-      <w:r>
-        <w:rPr>
-          <w:rFonts w:ascii="Arial" w:hAnsi="Arial" w:eastAsia="Arial" w:cs="Arial"/>
-          <w:b w:val="0"/>
-          <w:color w:val="000000"/>
-          <w:sz w:val="20"/>
-          <w:u w:val="none"/>
-        </w:rPr>
-        <w:t>2. Verify the login screen labels, buttons, and messages are displayed in the configured language.</w:t>
-      </w:r>
-    </w:p>
-    <w:p>
-      <w:pPr>
-        <w:spacing w:before="0" w:after="40"/>
-        <w:ind w:left="360" w:hanging="240"/>
-      </w:pPr>
-      <w:r>
-        <w:rPr>
-          <w:rFonts w:ascii="Arial" w:hAnsi="Arial" w:eastAsia="Arial" w:cs="Arial"/>
-          <w:b w:val="0"/>
-          <w:color w:val="000000"/>
-          <w:sz w:val="20"/>
-          <w:u w:val="none"/>
-        </w:rPr>
-        <w:t>3. Enter an incorrect passcode and verify the error message ("Unauthorized client") is translated.</w:t>
-      </w:r>
-    </w:p>
-    <w:p>
-      <w:pPr>
-        <w:spacing w:before="0" w:after="40"/>
-        <w:ind w:left="360" w:hanging="240"/>
-      </w:pPr>
-      <w:r>
-        <w:rPr>
-          <w:rFonts w:ascii="Arial" w:hAnsi="Arial" w:eastAsia="Arial" w:cs="Arial"/>
-          <w:b w:val="0"/>
-          <w:color w:val="000000"/>
-          <w:sz w:val="20"/>
-          <w:u w:val="none"/>
-        </w:rPr>
-        <w:t>4. Trigger a network error and verify the error message is translated.</w:t>
-      </w:r>
-    </w:p>
-    <w:p>
-      <w:pPr>
-        <w:spacing w:before="0" w:after="40"/>
-        <w:ind w:left="360" w:hanging="240"/>
-      </w:pPr>
-      <w:r>
-        <w:rPr>
-          <w:rFonts w:ascii="Arial" w:hAnsi="Arial" w:eastAsia="Arial" w:cs="Arial"/>
-          <w:b w:val="0"/>
-          <w:color w:val="000000"/>
-          <w:sz w:val="20"/>
-          <w:u w:val="none"/>
-        </w:rPr>
-        <w:t>5. Switch to another language and verify all login and related messages are translated.</w:t>
-      </w:r>
-    </w:p>
-    <w:p>
-      <w:pPr>
-        <w:spacing w:before="0" w:after="80"/>
-      </w:pPr>
-      <w:r>
-        <w:rPr>
-          <w:rFonts w:ascii="Arial" w:hAnsi="Arial" w:eastAsia="Arial" w:cs="Arial"/>
-          <w:b/>
-          <w:color w:val="000000"/>
-          <w:sz w:val="20"/>
-          <w:u w:val="none"/>
-        </w:rPr>
-        <w:t>Test Result(s):</w:t>
-      </w:r>
-    </w:p>
-    <w:p>
-      <w:pPr>
-        <w:spacing w:before="0" w:after="40"/>
-        <w:ind w:left="360" w:hanging="240"/>
-      </w:pPr>
-      <w:r>
-        <w:rPr>
-          <w:rFonts w:ascii="Arial" w:hAnsi="Arial" w:eastAsia="Arial" w:cs="Arial"/>
-          <w:b w:val="0"/>
-          <w:color w:val="000000"/>
-          <w:sz w:val="20"/>
-          <w:u w:val="none"/>
-        </w:rPr>
-        <w:t>1. The login screen labels and buttons are displayed in the configured language.</w:t>
-      </w:r>
-    </w:p>
-    <w:p>
-      <w:pPr>
-        <w:spacing w:before="0" w:after="40"/>
-        <w:ind w:left="360" w:hanging="240"/>
-      </w:pPr>
-      <w:r>
-        <w:rPr>
-          <w:rFonts w:ascii="Arial" w:hAnsi="Arial" w:eastAsia="Arial" w:cs="Arial"/>
-          <w:b w:val="0"/>
-          <w:color w:val="000000"/>
-          <w:sz w:val="20"/>
-          <w:u w:val="none"/>
-        </w:rPr>
-        <w:t>2. The "Unauthorized client" error message is translated for the incorrect passcode scenario.</w:t>
-      </w:r>
-    </w:p>
-    <w:p>
-      <w:pPr>
-        <w:spacing w:before="0" w:after="40"/>
-        <w:ind w:left="360" w:hanging="240"/>
-      </w:pPr>
-      <w:r>
-        <w:rPr>
-          <w:rFonts w:ascii="Arial" w:hAnsi="Arial" w:eastAsia="Arial" w:cs="Arial"/>
-          <w:b w:val="0"/>
-          <w:color w:val="000000"/>
-          <w:sz w:val="20"/>
-          <w:u w:val="none"/>
-        </w:rPr>
-        <w:t>3. The network error message is translated.</w:t>
-      </w:r>
-    </w:p>
-    <w:p>
-      <w:pPr>
-        <w:spacing w:before="0" w:after="40"/>
-        <w:ind w:left="360" w:hanging="240"/>
-      </w:pPr>
-      <w:r>
-        <w:rPr>
-          <w:rFonts w:ascii="Arial" w:hAnsi="Arial" w:eastAsia="Arial" w:cs="Arial"/>
-          <w:b w:val="0"/>
-          <w:color w:val="000000"/>
-          <w:sz w:val="20"/>
-          <w:u w:val="none"/>
-        </w:rPr>
-        <w:t>4. All login and related messages are correctly translated for each configured language.</w:t>
+        <w:t>2. The "Unauthorized client" and network error messages follow the selected translation</w:t>
       </w:r>
     </w:p>
     <w:sectPr>

</xml_diff>